<commit_message>
Documento de la pagina wed
Le entregamos el documento de nuestra pagina anime wed 
Paula Garzon
Mayra Murcia
Luciana Culma
Andre Bautista
</commit_message>
<xml_diff>
--- a/Página Web anime.docx
+++ b/Página Web anime.docx
@@ -41,7 +41,7 @@
           <w:pgNumType w:start="1"/>
         </w:sectPr>
       </w:pPr>
-      <w:bookmarkStart w:colFirst="0" w:colLast="0" w:name="_4ha53xneer16" w:id="0"/>
+      <w:bookmarkStart w:colFirst="0" w:colLast="0" w:name="_jm9o7tjr0yhu" w:id="0"/>
       <w:bookmarkEnd w:id="0"/>
       <w:r>
         <w:rPr>
@@ -70,7 +70,7 @@
     </w:p>
     <w:p>
       <w:pPr>
-        <w:spacing w:line="240" w:lineRule="auto"/>
+        <w:spacing w:line="480" w:lineRule="auto"/>
         <w:jc w:val="center"/>
         <w:rPr>
           <w:rFonts w:ascii="Times New Roman" w:cs="Times New Roman" w:eastAsia="Times New Roman" w:hAnsi="Times New Roman"/>
@@ -87,17 +87,17 @@
           <w:szCs w:val="24"/>
           <w:rtl w:val="0"/>
         </w:rPr>
-        <w:t xml:space="preserve">Página Web anime </w:t>
-      </w:r>
-      <w:r>
-        <w:rPr>
-          <w:rtl w:val="0"/>
-        </w:rPr>
-      </w:r>
-    </w:p>
-    <w:p>
-      <w:pPr>
-        <w:spacing w:line="240" w:lineRule="auto"/>
+        <w:t xml:space="preserve">Página Web anime</w:t>
+      </w:r>
+      <w:r>
+        <w:rPr>
+          <w:rtl w:val="0"/>
+        </w:rPr>
+      </w:r>
+    </w:p>
+    <w:p>
+      <w:pPr>
+        <w:spacing w:line="480" w:lineRule="auto"/>
         <w:jc w:val="center"/>
         <w:rPr>
           <w:rFonts w:ascii="Times New Roman" w:cs="Times New Roman" w:eastAsia="Times New Roman" w:hAnsi="Times New Roman"/>
@@ -113,7 +113,7 @@
     </w:p>
     <w:p>
       <w:pPr>
-        <w:spacing w:line="240" w:lineRule="auto"/>
+        <w:spacing w:line="480" w:lineRule="auto"/>
         <w:jc w:val="center"/>
         <w:rPr>
           <w:rFonts w:ascii="Times New Roman" w:cs="Times New Roman" w:eastAsia="Times New Roman" w:hAnsi="Times New Roman"/>
@@ -129,7 +129,7 @@
     </w:p>
     <w:p>
       <w:pPr>
-        <w:spacing w:line="240" w:lineRule="auto"/>
+        <w:spacing w:line="480" w:lineRule="auto"/>
         <w:jc w:val="center"/>
         <w:rPr>
           <w:rFonts w:ascii="Times New Roman" w:cs="Times New Roman" w:eastAsia="Times New Roman" w:hAnsi="Times New Roman"/>
@@ -145,7 +145,7 @@
     </w:p>
     <w:p>
       <w:pPr>
-        <w:spacing w:line="240" w:lineRule="auto"/>
+        <w:spacing w:line="480" w:lineRule="auto"/>
         <w:jc w:val="center"/>
         <w:rPr>
           <w:rFonts w:ascii="Times New Roman" w:cs="Times New Roman" w:eastAsia="Times New Roman" w:hAnsi="Times New Roman"/>
@@ -161,7 +161,7 @@
     </w:p>
     <w:p>
       <w:pPr>
-        <w:spacing w:line="240" w:lineRule="auto"/>
+        <w:spacing w:line="480" w:lineRule="auto"/>
         <w:jc w:val="center"/>
         <w:rPr>
           <w:rFonts w:ascii="Times New Roman" w:cs="Times New Roman" w:eastAsia="Times New Roman" w:hAnsi="Times New Roman"/>
@@ -177,7 +177,22 @@
     </w:p>
     <w:p>
       <w:pPr>
-        <w:spacing w:line="240" w:lineRule="auto"/>
+        <w:spacing w:line="480" w:lineRule="auto"/>
+        <w:rPr>
+          <w:rFonts w:ascii="Times New Roman" w:cs="Times New Roman" w:eastAsia="Times New Roman" w:hAnsi="Times New Roman"/>
+          <w:sz w:val="24"/>
+          <w:szCs w:val="24"/>
+        </w:rPr>
+      </w:pPr>
+      <w:r>
+        <w:rPr>
+          <w:rtl w:val="0"/>
+        </w:rPr>
+      </w:r>
+    </w:p>
+    <w:p>
+      <w:pPr>
+        <w:spacing w:line="480" w:lineRule="auto"/>
         <w:jc w:val="center"/>
         <w:rPr>
           <w:rFonts w:ascii="Times New Roman" w:cs="Times New Roman" w:eastAsia="Times New Roman" w:hAnsi="Times New Roman"/>
@@ -187,13 +202,17 @@
       </w:pPr>
       <w:r>
         <w:rPr>
-          <w:rtl w:val="0"/>
-        </w:rPr>
-      </w:r>
-    </w:p>
-    <w:p>
-      <w:pPr>
-        <w:spacing w:line="240" w:lineRule="auto"/>
+          <w:rFonts w:ascii="Times New Roman" w:cs="Times New Roman" w:eastAsia="Times New Roman" w:hAnsi="Times New Roman"/>
+          <w:sz w:val="24"/>
+          <w:szCs w:val="24"/>
+          <w:rtl w:val="0"/>
+        </w:rPr>
+        <w:t xml:space="preserve">Paula Garzon </w:t>
+      </w:r>
+    </w:p>
+    <w:p>
+      <w:pPr>
+        <w:spacing w:line="480" w:lineRule="auto"/>
         <w:jc w:val="center"/>
         <w:rPr>
           <w:rFonts w:ascii="Times New Roman" w:cs="Times New Roman" w:eastAsia="Times New Roman" w:hAnsi="Times New Roman"/>
@@ -203,13 +222,17 @@
       </w:pPr>
       <w:r>
         <w:rPr>
-          <w:rtl w:val="0"/>
-        </w:rPr>
-      </w:r>
-    </w:p>
-    <w:p>
-      <w:pPr>
-        <w:spacing w:line="240" w:lineRule="auto"/>
+          <w:rFonts w:ascii="Times New Roman" w:cs="Times New Roman" w:eastAsia="Times New Roman" w:hAnsi="Times New Roman"/>
+          <w:sz w:val="24"/>
+          <w:szCs w:val="24"/>
+          <w:rtl w:val="0"/>
+        </w:rPr>
+        <w:t xml:space="preserve">Laula Luciana Culma Bareño </w:t>
+      </w:r>
+    </w:p>
+    <w:p>
+      <w:pPr>
+        <w:spacing w:line="480" w:lineRule="auto"/>
         <w:jc w:val="center"/>
         <w:rPr>
           <w:rFonts w:ascii="Times New Roman" w:cs="Times New Roman" w:eastAsia="Times New Roman" w:hAnsi="Times New Roman"/>
@@ -219,13 +242,17 @@
       </w:pPr>
       <w:r>
         <w:rPr>
-          <w:rtl w:val="0"/>
-        </w:rPr>
-      </w:r>
-    </w:p>
-    <w:p>
-      <w:pPr>
-        <w:spacing w:line="240" w:lineRule="auto"/>
+          <w:rFonts w:ascii="Times New Roman" w:cs="Times New Roman" w:eastAsia="Times New Roman" w:hAnsi="Times New Roman"/>
+          <w:sz w:val="24"/>
+          <w:szCs w:val="24"/>
+          <w:rtl w:val="0"/>
+        </w:rPr>
+        <w:t xml:space="preserve">Mayra Isabella Murcia Mora</w:t>
+      </w:r>
+    </w:p>
+    <w:p>
+      <w:pPr>
+        <w:spacing w:line="480" w:lineRule="auto"/>
         <w:jc w:val="center"/>
         <w:rPr>
           <w:rFonts w:ascii="Times New Roman" w:cs="Times New Roman" w:eastAsia="Times New Roman" w:hAnsi="Times New Roman"/>
@@ -235,13 +262,17 @@
       </w:pPr>
       <w:r>
         <w:rPr>
-          <w:rtl w:val="0"/>
-        </w:rPr>
-      </w:r>
-    </w:p>
-    <w:p>
-      <w:pPr>
-        <w:spacing w:line="240" w:lineRule="auto"/>
+          <w:rFonts w:ascii="Times New Roman" w:cs="Times New Roman" w:eastAsia="Times New Roman" w:hAnsi="Times New Roman"/>
+          <w:sz w:val="24"/>
+          <w:szCs w:val="24"/>
+          <w:rtl w:val="0"/>
+        </w:rPr>
+        <w:t xml:space="preserve">Andres Felipe Bautista Pacheco</w:t>
+      </w:r>
+    </w:p>
+    <w:p>
+      <w:pPr>
+        <w:spacing w:line="480" w:lineRule="auto"/>
         <w:jc w:val="center"/>
         <w:rPr>
           <w:rFonts w:ascii="Times New Roman" w:cs="Times New Roman" w:eastAsia="Times New Roman" w:hAnsi="Times New Roman"/>
@@ -257,7 +288,7 @@
     </w:p>
     <w:p>
       <w:pPr>
-        <w:spacing w:line="240" w:lineRule="auto"/>
+        <w:spacing w:line="480" w:lineRule="auto"/>
         <w:jc w:val="center"/>
         <w:rPr>
           <w:rFonts w:ascii="Times New Roman" w:cs="Times New Roman" w:eastAsia="Times New Roman" w:hAnsi="Times New Roman"/>
@@ -273,7 +304,7 @@
     </w:p>
     <w:p>
       <w:pPr>
-        <w:spacing w:line="240" w:lineRule="auto"/>
+        <w:spacing w:line="480" w:lineRule="auto"/>
         <w:jc w:val="center"/>
         <w:rPr>
           <w:rFonts w:ascii="Times New Roman" w:cs="Times New Roman" w:eastAsia="Times New Roman" w:hAnsi="Times New Roman"/>
@@ -289,7 +320,7 @@
     </w:p>
     <w:p>
       <w:pPr>
-        <w:spacing w:line="240" w:lineRule="auto"/>
+        <w:spacing w:line="480" w:lineRule="auto"/>
         <w:jc w:val="center"/>
         <w:rPr>
           <w:rFonts w:ascii="Times New Roman" w:cs="Times New Roman" w:eastAsia="Times New Roman" w:hAnsi="Times New Roman"/>
@@ -305,7 +336,7 @@
     </w:p>
     <w:p>
       <w:pPr>
-        <w:spacing w:line="240" w:lineRule="auto"/>
+        <w:spacing w:line="480" w:lineRule="auto"/>
         <w:jc w:val="center"/>
         <w:rPr>
           <w:rFonts w:ascii="Times New Roman" w:cs="Times New Roman" w:eastAsia="Times New Roman" w:hAnsi="Times New Roman"/>
@@ -315,17 +346,13 @@
       </w:pPr>
       <w:r>
         <w:rPr>
-          <w:rFonts w:ascii="Times New Roman" w:cs="Times New Roman" w:eastAsia="Times New Roman" w:hAnsi="Times New Roman"/>
-          <w:sz w:val="24"/>
-          <w:szCs w:val="24"/>
-          <w:rtl w:val="0"/>
-        </w:rPr>
-        <w:tab/>
-      </w:r>
-    </w:p>
-    <w:p>
-      <w:pPr>
-        <w:spacing w:line="240" w:lineRule="auto"/>
+          <w:rtl w:val="0"/>
+        </w:rPr>
+      </w:r>
+    </w:p>
+    <w:p>
+      <w:pPr>
+        <w:spacing w:line="480" w:lineRule="auto"/>
         <w:jc w:val="center"/>
         <w:rPr>
           <w:rFonts w:ascii="Times New Roman" w:cs="Times New Roman" w:eastAsia="Times New Roman" w:hAnsi="Times New Roman"/>
@@ -341,7 +368,37 @@
     </w:p>
     <w:p>
       <w:pPr>
-        <w:spacing w:line="240" w:lineRule="auto"/>
+        <w:spacing w:line="480" w:lineRule="auto"/>
+        <w:rPr>
+          <w:rFonts w:ascii="Times New Roman" w:cs="Times New Roman" w:eastAsia="Times New Roman" w:hAnsi="Times New Roman"/>
+          <w:sz w:val="24"/>
+          <w:szCs w:val="24"/>
+        </w:rPr>
+      </w:pPr>
+      <w:r>
+        <w:rPr>
+          <w:rtl w:val="0"/>
+        </w:rPr>
+      </w:r>
+    </w:p>
+    <w:p>
+      <w:pPr>
+        <w:spacing w:line="480" w:lineRule="auto"/>
+        <w:rPr>
+          <w:rFonts w:ascii="Times New Roman" w:cs="Times New Roman" w:eastAsia="Times New Roman" w:hAnsi="Times New Roman"/>
+          <w:sz w:val="24"/>
+          <w:szCs w:val="24"/>
+        </w:rPr>
+      </w:pPr>
+      <w:r>
+        <w:rPr>
+          <w:rtl w:val="0"/>
+        </w:rPr>
+      </w:r>
+    </w:p>
+    <w:p>
+      <w:pPr>
+        <w:spacing w:line="480" w:lineRule="auto"/>
         <w:jc w:val="center"/>
         <w:rPr>
           <w:rFonts w:ascii="Times New Roman" w:cs="Times New Roman" w:eastAsia="Times New Roman" w:hAnsi="Times New Roman"/>
@@ -356,460 +413,12 @@
           <w:szCs w:val="24"/>
           <w:rtl w:val="0"/>
         </w:rPr>
-        <w:t xml:space="preserve">Paula Garzon </w:t>
-      </w:r>
-    </w:p>
-    <w:p>
-      <w:pPr>
-        <w:spacing w:line="240" w:lineRule="auto"/>
-        <w:jc w:val="center"/>
-        <w:rPr>
-          <w:rFonts w:ascii="Times New Roman" w:cs="Times New Roman" w:eastAsia="Times New Roman" w:hAnsi="Times New Roman"/>
-          <w:sz w:val="24"/>
-          <w:szCs w:val="24"/>
-        </w:rPr>
-      </w:pPr>
-      <w:r>
-        <w:rPr>
-          <w:rFonts w:ascii="Times New Roman" w:cs="Times New Roman" w:eastAsia="Times New Roman" w:hAnsi="Times New Roman"/>
-          <w:sz w:val="24"/>
-          <w:szCs w:val="24"/>
-          <w:rtl w:val="0"/>
-        </w:rPr>
-        <w:t xml:space="preserve">Laula Luciana Culma Bareño </w:t>
-      </w:r>
-    </w:p>
-    <w:p>
-      <w:pPr>
-        <w:spacing w:line="240" w:lineRule="auto"/>
-        <w:jc w:val="center"/>
-        <w:rPr>
-          <w:rFonts w:ascii="Times New Roman" w:cs="Times New Roman" w:eastAsia="Times New Roman" w:hAnsi="Times New Roman"/>
-          <w:sz w:val="24"/>
-          <w:szCs w:val="24"/>
-        </w:rPr>
-      </w:pPr>
-      <w:r>
-        <w:rPr>
-          <w:rFonts w:ascii="Times New Roman" w:cs="Times New Roman" w:eastAsia="Times New Roman" w:hAnsi="Times New Roman"/>
-          <w:sz w:val="24"/>
-          <w:szCs w:val="24"/>
-          <w:rtl w:val="0"/>
-        </w:rPr>
-        <w:t xml:space="preserve">Mayra Isabella Murcia Mora</w:t>
-      </w:r>
-    </w:p>
-    <w:p>
-      <w:pPr>
-        <w:spacing w:line="240" w:lineRule="auto"/>
-        <w:jc w:val="center"/>
-        <w:rPr>
-          <w:rFonts w:ascii="Times New Roman" w:cs="Times New Roman" w:eastAsia="Times New Roman" w:hAnsi="Times New Roman"/>
-          <w:sz w:val="24"/>
-          <w:szCs w:val="24"/>
-        </w:rPr>
-      </w:pPr>
-      <w:r>
-        <w:rPr>
-          <w:rFonts w:ascii="Times New Roman" w:cs="Times New Roman" w:eastAsia="Times New Roman" w:hAnsi="Times New Roman"/>
-          <w:sz w:val="24"/>
-          <w:szCs w:val="24"/>
-          <w:rtl w:val="0"/>
-        </w:rPr>
-        <w:t xml:space="preserve">Andres Felipe Bautista Pacheco</w:t>
-      </w:r>
-    </w:p>
-    <w:p>
-      <w:pPr>
-        <w:spacing w:line="240" w:lineRule="auto"/>
-        <w:jc w:val="center"/>
-        <w:rPr>
-          <w:rFonts w:ascii="Times New Roman" w:cs="Times New Roman" w:eastAsia="Times New Roman" w:hAnsi="Times New Roman"/>
-          <w:sz w:val="24"/>
-          <w:szCs w:val="24"/>
-        </w:rPr>
-      </w:pPr>
-      <w:r>
-        <w:rPr>
-          <w:rtl w:val="0"/>
-        </w:rPr>
-      </w:r>
-    </w:p>
-    <w:p>
-      <w:pPr>
-        <w:spacing w:line="240" w:lineRule="auto"/>
-        <w:jc w:val="center"/>
-        <w:rPr>
-          <w:rFonts w:ascii="Times New Roman" w:cs="Times New Roman" w:eastAsia="Times New Roman" w:hAnsi="Times New Roman"/>
-          <w:sz w:val="24"/>
-          <w:szCs w:val="24"/>
-        </w:rPr>
-      </w:pPr>
-      <w:r>
-        <w:rPr>
-          <w:rtl w:val="0"/>
-        </w:rPr>
-      </w:r>
-    </w:p>
-    <w:p>
-      <w:pPr>
-        <w:spacing w:line="240" w:lineRule="auto"/>
-        <w:jc w:val="center"/>
-        <w:rPr>
-          <w:rFonts w:ascii="Times New Roman" w:cs="Times New Roman" w:eastAsia="Times New Roman" w:hAnsi="Times New Roman"/>
-          <w:sz w:val="24"/>
-          <w:szCs w:val="24"/>
-        </w:rPr>
-      </w:pPr>
-      <w:r>
-        <w:rPr>
-          <w:rtl w:val="0"/>
-        </w:rPr>
-      </w:r>
-    </w:p>
-    <w:p>
-      <w:pPr>
-        <w:spacing w:line="240" w:lineRule="auto"/>
-        <w:jc w:val="center"/>
-        <w:rPr>
-          <w:rFonts w:ascii="Times New Roman" w:cs="Times New Roman" w:eastAsia="Times New Roman" w:hAnsi="Times New Roman"/>
-          <w:sz w:val="24"/>
-          <w:szCs w:val="24"/>
-        </w:rPr>
-      </w:pPr>
-      <w:r>
-        <w:rPr>
-          <w:rtl w:val="0"/>
-        </w:rPr>
-      </w:r>
-    </w:p>
-    <w:p>
-      <w:pPr>
-        <w:spacing w:line="240" w:lineRule="auto"/>
-        <w:jc w:val="center"/>
-        <w:rPr>
-          <w:rFonts w:ascii="Times New Roman" w:cs="Times New Roman" w:eastAsia="Times New Roman" w:hAnsi="Times New Roman"/>
-          <w:sz w:val="24"/>
-          <w:szCs w:val="24"/>
-        </w:rPr>
-      </w:pPr>
-      <w:r>
-        <w:rPr>
-          <w:rtl w:val="0"/>
-        </w:rPr>
-      </w:r>
-    </w:p>
-    <w:p>
-      <w:pPr>
-        <w:spacing w:line="240" w:lineRule="auto"/>
-        <w:jc w:val="center"/>
-        <w:rPr>
-          <w:rFonts w:ascii="Times New Roman" w:cs="Times New Roman" w:eastAsia="Times New Roman" w:hAnsi="Times New Roman"/>
-          <w:sz w:val="24"/>
-          <w:szCs w:val="24"/>
-        </w:rPr>
-      </w:pPr>
-      <w:r>
-        <w:rPr>
-          <w:rtl w:val="0"/>
-        </w:rPr>
-      </w:r>
-    </w:p>
-    <w:p>
-      <w:pPr>
-        <w:spacing w:line="240" w:lineRule="auto"/>
-        <w:jc w:val="center"/>
-        <w:rPr>
-          <w:rFonts w:ascii="Times New Roman" w:cs="Times New Roman" w:eastAsia="Times New Roman" w:hAnsi="Times New Roman"/>
-          <w:sz w:val="24"/>
-          <w:szCs w:val="24"/>
-        </w:rPr>
-      </w:pPr>
-      <w:r>
-        <w:rPr>
-          <w:rtl w:val="0"/>
-        </w:rPr>
-      </w:r>
-    </w:p>
-    <w:p>
-      <w:pPr>
-        <w:spacing w:line="240" w:lineRule="auto"/>
-        <w:jc w:val="center"/>
-        <w:rPr>
-          <w:rFonts w:ascii="Times New Roman" w:cs="Times New Roman" w:eastAsia="Times New Roman" w:hAnsi="Times New Roman"/>
-          <w:sz w:val="24"/>
-          <w:szCs w:val="24"/>
-        </w:rPr>
-      </w:pPr>
-      <w:r>
-        <w:rPr>
-          <w:rtl w:val="0"/>
-        </w:rPr>
-      </w:r>
-    </w:p>
-    <w:p>
-      <w:pPr>
-        <w:spacing w:line="240" w:lineRule="auto"/>
-        <w:jc w:val="center"/>
-        <w:rPr>
-          <w:rFonts w:ascii="Times New Roman" w:cs="Times New Roman" w:eastAsia="Times New Roman" w:hAnsi="Times New Roman"/>
-          <w:sz w:val="24"/>
-          <w:szCs w:val="24"/>
-        </w:rPr>
-      </w:pPr>
-      <w:r>
-        <w:rPr>
-          <w:rtl w:val="0"/>
-        </w:rPr>
-      </w:r>
-    </w:p>
-    <w:p>
-      <w:pPr>
-        <w:spacing w:line="240" w:lineRule="auto"/>
-        <w:jc w:val="center"/>
-        <w:rPr>
-          <w:rFonts w:ascii="Times New Roman" w:cs="Times New Roman" w:eastAsia="Times New Roman" w:hAnsi="Times New Roman"/>
-          <w:sz w:val="24"/>
-          <w:szCs w:val="24"/>
-        </w:rPr>
-      </w:pPr>
-      <w:r>
-        <w:rPr>
-          <w:rtl w:val="0"/>
-        </w:rPr>
-      </w:r>
-    </w:p>
-    <w:p>
-      <w:pPr>
-        <w:spacing w:line="240" w:lineRule="auto"/>
-        <w:jc w:val="center"/>
-        <w:rPr>
-          <w:rFonts w:ascii="Times New Roman" w:cs="Times New Roman" w:eastAsia="Times New Roman" w:hAnsi="Times New Roman"/>
-          <w:sz w:val="24"/>
-          <w:szCs w:val="24"/>
-        </w:rPr>
-      </w:pPr>
-      <w:r>
-        <w:rPr>
-          <w:rtl w:val="0"/>
-        </w:rPr>
-      </w:r>
-    </w:p>
-    <w:p>
-      <w:pPr>
-        <w:spacing w:line="240" w:lineRule="auto"/>
-        <w:jc w:val="center"/>
-        <w:rPr>
-          <w:rFonts w:ascii="Times New Roman" w:cs="Times New Roman" w:eastAsia="Times New Roman" w:hAnsi="Times New Roman"/>
-          <w:sz w:val="24"/>
-          <w:szCs w:val="24"/>
-        </w:rPr>
-      </w:pPr>
-      <w:r>
-        <w:rPr>
-          <w:rtl w:val="0"/>
-        </w:rPr>
-      </w:r>
-    </w:p>
-    <w:p>
-      <w:pPr>
-        <w:spacing w:line="240" w:lineRule="auto"/>
-        <w:jc w:val="center"/>
-        <w:rPr>
-          <w:rFonts w:ascii="Times New Roman" w:cs="Times New Roman" w:eastAsia="Times New Roman" w:hAnsi="Times New Roman"/>
-          <w:sz w:val="24"/>
-          <w:szCs w:val="24"/>
-        </w:rPr>
-      </w:pPr>
-      <w:r>
-        <w:rPr>
-          <w:rtl w:val="0"/>
-        </w:rPr>
-      </w:r>
-    </w:p>
-    <w:p>
-      <w:pPr>
-        <w:spacing w:line="240" w:lineRule="auto"/>
-        <w:jc w:val="center"/>
-        <w:rPr>
-          <w:rFonts w:ascii="Times New Roman" w:cs="Times New Roman" w:eastAsia="Times New Roman" w:hAnsi="Times New Roman"/>
-          <w:sz w:val="24"/>
-          <w:szCs w:val="24"/>
-        </w:rPr>
-      </w:pPr>
-      <w:r>
-        <w:rPr>
-          <w:rtl w:val="0"/>
-        </w:rPr>
-      </w:r>
-    </w:p>
-    <w:p>
-      <w:pPr>
-        <w:spacing w:line="240" w:lineRule="auto"/>
-        <w:jc w:val="center"/>
-        <w:rPr>
-          <w:rFonts w:ascii="Times New Roman" w:cs="Times New Roman" w:eastAsia="Times New Roman" w:hAnsi="Times New Roman"/>
-          <w:sz w:val="24"/>
-          <w:szCs w:val="24"/>
-        </w:rPr>
-      </w:pPr>
-      <w:r>
-        <w:rPr>
-          <w:rtl w:val="0"/>
-        </w:rPr>
-      </w:r>
-    </w:p>
-    <w:p>
-      <w:pPr>
-        <w:spacing w:line="240" w:lineRule="auto"/>
-        <w:jc w:val="center"/>
-        <w:rPr>
-          <w:rFonts w:ascii="Times New Roman" w:cs="Times New Roman" w:eastAsia="Times New Roman" w:hAnsi="Times New Roman"/>
-          <w:sz w:val="24"/>
-          <w:szCs w:val="24"/>
-        </w:rPr>
-      </w:pPr>
-      <w:r>
-        <w:rPr>
-          <w:rtl w:val="0"/>
-        </w:rPr>
-      </w:r>
-    </w:p>
-    <w:p>
-      <w:pPr>
-        <w:spacing w:line="240" w:lineRule="auto"/>
-        <w:jc w:val="center"/>
-        <w:rPr>
-          <w:rFonts w:ascii="Times New Roman" w:cs="Times New Roman" w:eastAsia="Times New Roman" w:hAnsi="Times New Roman"/>
-          <w:sz w:val="24"/>
-          <w:szCs w:val="24"/>
-        </w:rPr>
-      </w:pPr>
-      <w:r>
-        <w:rPr>
-          <w:rtl w:val="0"/>
-        </w:rPr>
-      </w:r>
-    </w:p>
-    <w:p>
-      <w:pPr>
-        <w:spacing w:line="240" w:lineRule="auto"/>
-        <w:jc w:val="center"/>
-        <w:rPr>
-          <w:rFonts w:ascii="Times New Roman" w:cs="Times New Roman" w:eastAsia="Times New Roman" w:hAnsi="Times New Roman"/>
-          <w:sz w:val="24"/>
-          <w:szCs w:val="24"/>
-        </w:rPr>
-      </w:pPr>
-      <w:r>
-        <w:rPr>
-          <w:rtl w:val="0"/>
-        </w:rPr>
-      </w:r>
-    </w:p>
-    <w:p>
-      <w:pPr>
-        <w:spacing w:line="240" w:lineRule="auto"/>
-        <w:jc w:val="center"/>
-        <w:rPr>
-          <w:rFonts w:ascii="Times New Roman" w:cs="Times New Roman" w:eastAsia="Times New Roman" w:hAnsi="Times New Roman"/>
-          <w:sz w:val="24"/>
-          <w:szCs w:val="24"/>
-        </w:rPr>
-      </w:pPr>
-      <w:r>
-        <w:rPr>
-          <w:rtl w:val="0"/>
-        </w:rPr>
-      </w:r>
-    </w:p>
-    <w:p>
-      <w:pPr>
-        <w:spacing w:line="240" w:lineRule="auto"/>
-        <w:jc w:val="center"/>
-        <w:rPr>
-          <w:rFonts w:ascii="Times New Roman" w:cs="Times New Roman" w:eastAsia="Times New Roman" w:hAnsi="Times New Roman"/>
-          <w:sz w:val="24"/>
-          <w:szCs w:val="24"/>
-        </w:rPr>
-      </w:pPr>
-      <w:r>
-        <w:rPr>
-          <w:rtl w:val="0"/>
-        </w:rPr>
-      </w:r>
-    </w:p>
-    <w:p>
-      <w:pPr>
-        <w:spacing w:line="240" w:lineRule="auto"/>
-        <w:jc w:val="center"/>
-        <w:rPr>
-          <w:rFonts w:ascii="Times New Roman" w:cs="Times New Roman" w:eastAsia="Times New Roman" w:hAnsi="Times New Roman"/>
-          <w:sz w:val="24"/>
-          <w:szCs w:val="24"/>
-        </w:rPr>
-      </w:pPr>
-      <w:r>
-        <w:rPr>
-          <w:rtl w:val="0"/>
-        </w:rPr>
-      </w:r>
-    </w:p>
-    <w:p>
-      <w:pPr>
-        <w:spacing w:line="240" w:lineRule="auto"/>
-        <w:jc w:val="center"/>
-        <w:rPr>
-          <w:rFonts w:ascii="Times New Roman" w:cs="Times New Roman" w:eastAsia="Times New Roman" w:hAnsi="Times New Roman"/>
-          <w:sz w:val="24"/>
-          <w:szCs w:val="24"/>
-        </w:rPr>
-      </w:pPr>
-      <w:r>
-        <w:rPr>
-          <w:rtl w:val="0"/>
-        </w:rPr>
-      </w:r>
-    </w:p>
-    <w:p>
-      <w:pPr>
-        <w:spacing w:line="240" w:lineRule="auto"/>
-        <w:jc w:val="center"/>
-        <w:rPr>
-          <w:rFonts w:ascii="Times New Roman" w:cs="Times New Roman" w:eastAsia="Times New Roman" w:hAnsi="Times New Roman"/>
-          <w:sz w:val="24"/>
-          <w:szCs w:val="24"/>
-        </w:rPr>
-      </w:pPr>
-      <w:r>
-        <w:rPr>
-          <w:rtl w:val="0"/>
-        </w:rPr>
-      </w:r>
-    </w:p>
-    <w:p>
-      <w:pPr>
-        <w:spacing w:line="240" w:lineRule="auto"/>
-        <w:jc w:val="center"/>
-        <w:rPr>
-          <w:rFonts w:ascii="Times New Roman" w:cs="Times New Roman" w:eastAsia="Times New Roman" w:hAnsi="Times New Roman"/>
-          <w:sz w:val="24"/>
-          <w:szCs w:val="24"/>
-        </w:rPr>
-      </w:pPr>
-      <w:r>
-        <w:rPr>
-          <w:rFonts w:ascii="Times New Roman" w:cs="Times New Roman" w:eastAsia="Times New Roman" w:hAnsi="Times New Roman"/>
-          <w:sz w:val="24"/>
-          <w:szCs w:val="24"/>
-          <w:rtl w:val="0"/>
-        </w:rPr>
         <w:t xml:space="preserve">Colegio Nuestra Señora De Nazareth</w:t>
       </w:r>
     </w:p>
     <w:p>
       <w:pPr>
-        <w:spacing w:line="240" w:lineRule="auto"/>
+        <w:spacing w:line="480" w:lineRule="auto"/>
         <w:jc w:val="center"/>
         <w:rPr>
           <w:rFonts w:ascii="Times New Roman" w:cs="Times New Roman" w:eastAsia="Times New Roman" w:hAnsi="Times New Roman"/>
@@ -833,7 +442,7 @@
         <w:keepNext w:val="0"/>
         <w:keepLines w:val="0"/>
         <w:shd w:fill="ffffff" w:val="clear"/>
-        <w:spacing w:after="160" w:before="80" w:line="264" w:lineRule="auto"/>
+        <w:spacing w:after="160" w:before="80" w:line="480" w:lineRule="auto"/>
         <w:ind w:left="90"/>
         <w:jc w:val="center"/>
         <w:rPr>
@@ -858,7 +467,7 @@
     </w:p>
     <w:p>
       <w:pPr>
-        <w:spacing w:line="240" w:lineRule="auto"/>
+        <w:spacing w:line="480" w:lineRule="auto"/>
         <w:ind w:left="90" w:firstLine="0"/>
         <w:jc w:val="center"/>
         <w:rPr>
@@ -875,7 +484,7 @@
     </w:p>
     <w:p>
       <w:pPr>
-        <w:spacing w:line="240" w:lineRule="auto"/>
+        <w:spacing w:line="480" w:lineRule="auto"/>
         <w:ind w:left="90" w:firstLine="0"/>
         <w:jc w:val="center"/>
         <w:rPr>
@@ -894,7 +503,7 @@
     </w:p>
     <w:p>
       <w:pPr>
-        <w:spacing w:line="240" w:lineRule="auto"/>
+        <w:spacing w:line="480" w:lineRule="auto"/>
         <w:ind w:left="90" w:firstLine="0"/>
         <w:jc w:val="center"/>
         <w:rPr>
@@ -913,7 +522,7 @@
     </w:p>
     <w:sdt>
       <w:sdtPr>
-        <w:id w:val="-231083719"/>
+        <w:id w:val="2077392431"/>
         <w:docPartObj>
           <w:docPartGallery w:val="Table of Contents"/>
           <w:docPartUnique w:val="1"/>
@@ -972,7 +581,7 @@
               </w:rPr>
               <w:t xml:space="preserve">Tema del Aplicativo</w:t>
               <w:tab/>
-              <w:t xml:space="preserve">2</w:t>
+              <w:t xml:space="preserve">3</w:t>
             </w:r>
           </w:hyperlink>
           <w:r>
@@ -1084,7 +693,7 @@
               </w:rPr>
               <w:t xml:space="preserve">Para qué sirve PHP?</w:t>
               <w:tab/>
-              <w:t xml:space="preserve">3</w:t>
+              <w:t xml:space="preserve">4</w:t>
             </w:r>
           </w:hyperlink>
           <w:r>
@@ -1110,7 +719,7 @@
               </w:rPr>
               <w:t xml:space="preserve">¿Cómo funciona PHP?</w:t>
               <w:tab/>
-              <w:t xml:space="preserve">3</w:t>
+              <w:t xml:space="preserve">4</w:t>
             </w:r>
           </w:hyperlink>
           <w:r>
@@ -1136,7 +745,7 @@
               </w:rPr>
               <w:t xml:space="preserve">¿Qué proyectos se pueden crear con PHP?</w:t>
               <w:tab/>
-              <w:t xml:space="preserve">3</w:t>
+              <w:t xml:space="preserve">4</w:t>
             </w:r>
           </w:hyperlink>
           <w:r>
@@ -1192,7 +801,7 @@
               </w:rPr>
               <w:t xml:space="preserve">Diferencia entre PHP tradicional y los frameworks</w:t>
               <w:tab/>
-              <w:t xml:space="preserve">4</w:t>
+              <w:t xml:space="preserve">5</w:t>
             </w:r>
           </w:hyperlink>
           <w:r>
@@ -1222,7 +831,7 @@
               </w:rPr>
               <w:t xml:space="preserve">Framework utilizado</w:t>
               <w:tab/>
-              <w:t xml:space="preserve">5</w:t>
+              <w:t xml:space="preserve">6</w:t>
             </w:r>
           </w:hyperlink>
           <w:r>
@@ -1248,7 +857,7 @@
               </w:rPr>
               <w:t xml:space="preserve">¿Por qué escogimos Bootstrap?</w:t>
               <w:tab/>
-              <w:t xml:space="preserve">5</w:t>
+              <w:t xml:space="preserve">7</w:t>
             </w:r>
           </w:hyperlink>
           <w:r>
@@ -1278,7 +887,7 @@
               </w:rPr>
               <w:t xml:space="preserve">Tecnologías utilizadas</w:t>
               <w:tab/>
-              <w:t xml:space="preserve">5</w:t>
+              <w:t xml:space="preserve">7</w:t>
             </w:r>
           </w:hyperlink>
           <w:r>
@@ -1304,7 +913,7 @@
               </w:rPr>
               <w:t xml:space="preserve">HTML</w:t>
               <w:tab/>
-              <w:t xml:space="preserve">5</w:t>
+              <w:t xml:space="preserve">7</w:t>
             </w:r>
           </w:hyperlink>
           <w:r>
@@ -1330,7 +939,7 @@
               </w:rPr>
               <w:t xml:space="preserve">CSS</w:t>
               <w:tab/>
-              <w:t xml:space="preserve">6</w:t>
+              <w:t xml:space="preserve">7</w:t>
             </w:r>
           </w:hyperlink>
           <w:r>
@@ -1356,7 +965,7 @@
               </w:rPr>
               <w:t xml:space="preserve">JavaScript</w:t>
               <w:tab/>
-              <w:t xml:space="preserve">6</w:t>
+              <w:t xml:space="preserve">7</w:t>
             </w:r>
           </w:hyperlink>
           <w:r>
@@ -1382,7 +991,7 @@
               </w:rPr>
               <w:t xml:space="preserve">Bootstrap</w:t>
               <w:tab/>
-              <w:t xml:space="preserve">6</w:t>
+              <w:t xml:space="preserve">7</w:t>
             </w:r>
           </w:hyperlink>
           <w:r>
@@ -1408,7 +1017,7 @@
               </w:rPr>
               <w:t xml:space="preserve">Git y GitHub</w:t>
               <w:tab/>
-              <w:t xml:space="preserve">6</w:t>
+              <w:t xml:space="preserve">7</w:t>
             </w:r>
           </w:hyperlink>
           <w:r>
@@ -1438,7 +1047,7 @@
               </w:rPr>
               <w:t xml:space="preserve">Explicación del diseño</w:t>
               <w:tab/>
-              <w:t xml:space="preserve">6</w:t>
+              <w:t xml:space="preserve">8</w:t>
             </w:r>
           </w:hyperlink>
           <w:r>
@@ -1468,7 +1077,127 @@
               </w:rPr>
               <w:t xml:space="preserve">Componentes que tendrá el proyecto</w:t>
               <w:tab/>
-              <w:t xml:space="preserve">6</w:t>
+              <w:t xml:space="preserve">8</w:t>
+            </w:r>
+          </w:hyperlink>
+          <w:r>
+            <w:rPr>
+              <w:rtl w:val="0"/>
+            </w:rPr>
+          </w:r>
+        </w:p>
+        <w:p>
+          <w:pPr>
+            <w:widowControl w:val="0"/>
+            <w:tabs>
+              <w:tab w:val="right" w:leader="none" w:pos="12000"/>
+            </w:tabs>
+            <w:spacing w:before="60" w:line="240" w:lineRule="auto"/>
+            <w:rPr>
+              <w:b w:val="1"/>
+              <w:bCs w:val="1"/>
+            </w:rPr>
+          </w:pPr>
+          <w:hyperlink w:anchor="_xh6b6okjz7my">
+            <w:r>
+              <w:rPr>
+                <w:b w:val="1"/>
+                <w:bCs w:val="1"/>
+                <w:rtl w:val="0"/>
+              </w:rPr>
+              <w:t xml:space="preserve">Referencias</w:t>
+              <w:tab/>
+              <w:t xml:space="preserve">9</w:t>
+            </w:r>
+          </w:hyperlink>
+          <w:r>
+            <w:rPr>
+              <w:rtl w:val="0"/>
+            </w:rPr>
+          </w:r>
+        </w:p>
+        <w:p>
+          <w:pPr>
+            <w:widowControl w:val="0"/>
+            <w:tabs>
+              <w:tab w:val="right" w:leader="none" w:pos="12000"/>
+            </w:tabs>
+            <w:spacing w:before="60" w:line="240" w:lineRule="auto"/>
+            <w:rPr>
+              <w:b w:val="1"/>
+              <w:bCs w:val="1"/>
+            </w:rPr>
+          </w:pPr>
+          <w:hyperlink w:anchor="_541usnlsfhfv">
+            <w:r>
+              <w:rPr>
+                <w:b w:val="1"/>
+                <w:bCs w:val="1"/>
+                <w:rtl w:val="0"/>
+              </w:rPr>
+              <w:t xml:space="preserve">PHP Group. (2025). PHP Documentation. https://www.php.net</w:t>
+              <w:tab/>
+              <w:t xml:space="preserve">9</w:t>
+            </w:r>
+          </w:hyperlink>
+          <w:r>
+            <w:rPr>
+              <w:rtl w:val="0"/>
+            </w:rPr>
+          </w:r>
+        </w:p>
+        <w:p>
+          <w:pPr>
+            <w:widowControl w:val="0"/>
+            <w:tabs>
+              <w:tab w:val="right" w:leader="none" w:pos="12000"/>
+            </w:tabs>
+            <w:spacing w:before="60" w:line="240" w:lineRule="auto"/>
+            <w:rPr>
+              <w:b w:val="1"/>
+              <w:bCs w:val="1"/>
+            </w:rPr>
+          </w:pPr>
+          <w:hyperlink w:anchor="_541usnlsfhfv">
+            <w:r>
+              <w:rPr>
+                <w:b w:val="1"/>
+                <w:bCs w:val="1"/>
+                <w:rtl w:val="0"/>
+              </w:rPr>
+              <w:t xml:space="preserve">Bootstrap Team. (2025). Bootstrap Documentation. https://getbootstrap.com</w:t>
+              <w:tab/>
+              <w:t xml:space="preserve">9</w:t>
+            </w:r>
+          </w:hyperlink>
+          <w:r>
+            <w:rPr>
+              <w:rtl w:val="0"/>
+            </w:rPr>
+          </w:r>
+        </w:p>
+        <w:p>
+          <w:pPr>
+            <w:widowControl w:val="0"/>
+            <w:tabs>
+              <w:tab w:val="right" w:leader="none" w:pos="12000"/>
+            </w:tabs>
+            <w:spacing w:before="60" w:line="240" w:lineRule="auto"/>
+            <w:rPr>
+              <w:b w:val="1"/>
+              <w:bCs w:val="1"/>
+            </w:rPr>
+          </w:pPr>
+          <w:hyperlink w:anchor="_6d121586cvsm">
+            <w:r>
+              <w:rPr>
+                <w:b w:val="1"/>
+                <w:bCs w:val="1"/>
+                <w:rtl w:val="0"/>
+              </w:rPr>
+              <w:t xml:space="preserve">GitHub. (2025). GitHub Docs. https://docs.github.com</w:t>
+              <w:tab/>
+              <w:t xml:space="preserve">9</w:t>
             </w:r>
           </w:hyperlink>
           <w:r>
@@ -1498,7 +1227,7 @@
               </w:rPr>
               <w:t xml:space="preserve">Conclusiones</w:t>
               <w:tab/>
-              <w:t xml:space="preserve">6</w:t>
+              <w:t xml:space="preserve">9</w:t>
             </w:r>
           </w:hyperlink>
           <w:r>
@@ -1515,7 +1244,7 @@
     <w:p>
       <w:pPr>
         <w:pStyle w:val="Title"/>
-        <w:spacing w:after="240" w:before="240" w:line="240" w:lineRule="auto"/>
+        <w:spacing w:after="240" w:before="240" w:line="480" w:lineRule="auto"/>
         <w:jc w:val="center"/>
         <w:rPr>
           <w:rFonts w:ascii="Times New Roman" w:cs="Times New Roman" w:eastAsia="Times New Roman" w:hAnsi="Times New Roman"/>
@@ -1536,7 +1265,7 @@
     <w:p>
       <w:pPr>
         <w:pStyle w:val="Heading1"/>
-        <w:spacing w:after="240" w:before="240" w:line="240" w:lineRule="auto"/>
+        <w:spacing w:after="240" w:before="240" w:line="480" w:lineRule="auto"/>
         <w:jc w:val="center"/>
         <w:rPr>
           <w:rFonts w:ascii="Times New Roman" w:cs="Times New Roman" w:eastAsia="Times New Roman" w:hAnsi="Times New Roman"/>
@@ -1554,7 +1283,7 @@
     </w:p>
     <w:p>
       <w:pPr>
-        <w:spacing w:after="240" w:before="240" w:line="240" w:lineRule="auto"/>
+        <w:spacing w:after="240" w:before="240" w:line="480" w:lineRule="auto"/>
         <w:rPr/>
       </w:pPr>
       <w:r>
@@ -1575,7 +1304,7 @@
     <w:p>
       <w:pPr>
         <w:pStyle w:val="Heading1"/>
-        <w:spacing w:after="240" w:before="240" w:line="240" w:lineRule="auto"/>
+        <w:spacing w:after="240" w:before="240" w:line="480" w:lineRule="auto"/>
         <w:jc w:val="center"/>
         <w:rPr>
           <w:rFonts w:ascii="Times New Roman" w:cs="Times New Roman" w:eastAsia="Times New Roman" w:hAnsi="Times New Roman"/>
@@ -1594,7 +1323,7 @@
     <w:p>
       <w:pPr>
         <w:pStyle w:val="Title"/>
-        <w:spacing w:after="240" w:before="240" w:line="240" w:lineRule="auto"/>
+        <w:spacing w:after="240" w:before="240" w:line="480" w:lineRule="auto"/>
         <w:rPr/>
       </w:pPr>
       <w:bookmarkStart w:colFirst="0" w:colLast="0" w:name="_lqkdb4gajsan" w:id="5"/>
@@ -1619,7 +1348,7 @@
         <w:pStyle w:val="Heading1"/>
         <w:keepNext w:val="0"/>
         <w:keepLines w:val="0"/>
-        <w:spacing w:before="480" w:lineRule="auto"/>
+        <w:spacing w:before="480" w:line="480" w:lineRule="auto"/>
         <w:rPr>
           <w:rFonts w:ascii="Times New Roman" w:cs="Times New Roman" w:eastAsia="Times New Roman" w:hAnsi="Times New Roman"/>
         </w:rPr>
@@ -1639,7 +1368,7 @@
         <w:pStyle w:val="Heading2"/>
         <w:keepNext w:val="0"/>
         <w:keepLines w:val="0"/>
-        <w:spacing w:after="80" w:lineRule="auto"/>
+        <w:spacing w:after="80" w:line="480" w:lineRule="auto"/>
         <w:rPr>
           <w:rFonts w:ascii="Times New Roman" w:cs="Times New Roman" w:eastAsia="Times New Roman" w:hAnsi="Times New Roman"/>
           <w:sz w:val="24"/>
@@ -1660,21 +1389,41 @@
     </w:p>
     <w:p>
       <w:pPr>
-        <w:spacing w:after="240" w:before="240" w:lineRule="auto"/>
-        <w:rPr>
-          <w:rFonts w:ascii="Times New Roman" w:cs="Times New Roman" w:eastAsia="Times New Roman" w:hAnsi="Times New Roman"/>
-          <w:sz w:val="24"/>
-          <w:szCs w:val="24"/>
-        </w:rPr>
-      </w:pPr>
-      <w:r>
-        <w:rPr>
-          <w:rFonts w:ascii="Times New Roman" w:cs="Times New Roman" w:eastAsia="Times New Roman" w:hAnsi="Times New Roman"/>
-          <w:sz w:val="24"/>
-          <w:szCs w:val="24"/>
-          <w:rtl w:val="0"/>
-        </w:rPr>
-        <w:t xml:space="preserve">PHP es un lenguaje de programación utilizado principalmente para el desarrollo de páginas y aplicaciones web dinámicas. Este lenguaje permite crear sitios interactivos que pueden procesar información, conectarse a bases de datos y mostrar contenido personalizado a los usuarios. Gracias a su facilidad de uso y versatilidad, PHP es uno de los lenguajes más utilizados en el desarrollo web.</w:t>
+        <w:spacing w:after="240" w:before="240" w:line="480" w:lineRule="auto"/>
+        <w:rPr>
+          <w:rFonts w:ascii="Times New Roman" w:cs="Times New Roman" w:eastAsia="Times New Roman" w:hAnsi="Times New Roman"/>
+          <w:sz w:val="24"/>
+          <w:szCs w:val="24"/>
+        </w:rPr>
+      </w:pPr>
+      <w:r>
+        <w:rPr>
+          <w:rFonts w:ascii="Times New Roman" w:cs="Times New Roman" w:eastAsia="Times New Roman" w:hAnsi="Times New Roman"/>
+          <w:sz w:val="24"/>
+          <w:szCs w:val="24"/>
+          <w:rtl w:val="0"/>
+        </w:rPr>
+        <w:t xml:space="preserve">PHP es un lenguaje de programación utilizado principalmente para el desarrollo de páginas y aplicaciones web dinámicas. Este lenguaje permite crear sitios interactivos que pueden procesar información, conectarse a bases de datos y mostrar contenido personalizado a los usuarios. Gracias a su facilidad de uso y versatilidad, PHP es uno de los lenguajes más utilizados en el desarrollo web. </w:t>
+      </w:r>
+      <w:r>
+        <w:rPr>
+          <w:rFonts w:ascii="Times New Roman" w:cs="Times New Roman" w:eastAsia="Times New Roman" w:hAnsi="Times New Roman"/>
+          <w:b w:val="1"/>
+          <w:bCs w:val="1"/>
+          <w:sz w:val="24"/>
+          <w:szCs w:val="24"/>
+          <w:rtl w:val="0"/>
+        </w:rPr>
+        <w:t xml:space="preserve">(PHP Group, 2025)</w:t>
+      </w:r>
+      <w:r>
+        <w:rPr>
+          <w:rFonts w:ascii="Times New Roman" w:cs="Times New Roman" w:eastAsia="Times New Roman" w:hAnsi="Times New Roman"/>
+          <w:sz w:val="24"/>
+          <w:szCs w:val="24"/>
+          <w:rtl w:val="0"/>
+        </w:rPr>
+        <w:t xml:space="preserve">. </w:t>
       </w:r>
     </w:p>
     <w:p>
@@ -1682,7 +1431,7 @@
         <w:pStyle w:val="Heading2"/>
         <w:keepNext w:val="0"/>
         <w:keepLines w:val="0"/>
-        <w:spacing w:after="80" w:lineRule="auto"/>
+        <w:spacing w:after="80" w:line="480" w:lineRule="auto"/>
         <w:rPr>
           <w:rFonts w:ascii="Times New Roman" w:cs="Times New Roman" w:eastAsia="Times New Roman" w:hAnsi="Times New Roman"/>
           <w:b w:val="1"/>
@@ -1707,7 +1456,7 @@
     </w:p>
     <w:p>
       <w:pPr>
-        <w:spacing w:after="240" w:before="240" w:lineRule="auto"/>
+        <w:spacing w:after="240" w:before="240" w:line="480" w:lineRule="auto"/>
         <w:rPr>
           <w:rFonts w:ascii="Times New Roman" w:cs="Times New Roman" w:eastAsia="Times New Roman" w:hAnsi="Times New Roman"/>
           <w:sz w:val="24"/>
@@ -1729,7 +1478,7 @@
         <w:pStyle w:val="Heading2"/>
         <w:keepNext w:val="0"/>
         <w:keepLines w:val="0"/>
-        <w:spacing w:after="80" w:lineRule="auto"/>
+        <w:spacing w:after="80" w:line="480" w:lineRule="auto"/>
         <w:rPr>
           <w:rFonts w:ascii="Times New Roman" w:cs="Times New Roman" w:eastAsia="Times New Roman" w:hAnsi="Times New Roman"/>
           <w:b w:val="1"/>
@@ -1754,7 +1503,7 @@
     </w:p>
     <w:p>
       <w:pPr>
-        <w:spacing w:after="240" w:before="240" w:lineRule="auto"/>
+        <w:spacing w:after="240" w:before="240" w:line="480" w:lineRule="auto"/>
         <w:rPr>
           <w:rFonts w:ascii="Times New Roman" w:cs="Times New Roman" w:eastAsia="Times New Roman" w:hAnsi="Times New Roman"/>
           <w:sz w:val="24"/>
@@ -1776,7 +1525,7 @@
         <w:pStyle w:val="Heading2"/>
         <w:keepNext w:val="0"/>
         <w:keepLines w:val="0"/>
-        <w:spacing w:after="80" w:lineRule="auto"/>
+        <w:spacing w:after="80" w:line="480" w:lineRule="auto"/>
         <w:rPr>
           <w:rFonts w:ascii="Times New Roman" w:cs="Times New Roman" w:eastAsia="Times New Roman" w:hAnsi="Times New Roman"/>
           <w:b w:val="1"/>
@@ -1801,7 +1550,7 @@
     </w:p>
     <w:p>
       <w:pPr>
-        <w:spacing w:after="240" w:before="240" w:lineRule="auto"/>
+        <w:spacing w:after="240" w:before="240" w:line="480" w:lineRule="auto"/>
         <w:rPr>
           <w:rFonts w:ascii="Times New Roman" w:cs="Times New Roman" w:eastAsia="Times New Roman" w:hAnsi="Times New Roman"/>
           <w:sz w:val="24"/>
@@ -1824,7 +1573,7 @@
           <w:ilvl w:val="0"/>
           <w:numId w:val="1"/>
         </w:numPr>
-        <w:spacing w:after="0" w:afterAutospacing="0" w:before="240" w:lineRule="auto"/>
+        <w:spacing w:after="0" w:afterAutospacing="0" w:before="240" w:line="480" w:lineRule="auto"/>
         <w:ind w:left="720" w:hanging="360"/>
         <w:rPr>
           <w:rFonts w:ascii="Times New Roman" w:cs="Times New Roman" w:eastAsia="Times New Roman" w:hAnsi="Times New Roman"/>
@@ -1848,7 +1597,7 @@
           <w:ilvl w:val="0"/>
           <w:numId w:val="1"/>
         </w:numPr>
-        <w:spacing w:after="0" w:afterAutospacing="0" w:before="0" w:beforeAutospacing="0" w:lineRule="auto"/>
+        <w:spacing w:after="0" w:afterAutospacing="0" w:before="0" w:beforeAutospacing="0" w:line="480" w:lineRule="auto"/>
         <w:ind w:left="720" w:hanging="360"/>
         <w:rPr>
           <w:rFonts w:ascii="Times New Roman" w:cs="Times New Roman" w:eastAsia="Times New Roman" w:hAnsi="Times New Roman"/>
@@ -1872,7 +1621,7 @@
           <w:ilvl w:val="0"/>
           <w:numId w:val="1"/>
         </w:numPr>
-        <w:spacing w:after="0" w:afterAutospacing="0" w:before="0" w:beforeAutospacing="0" w:lineRule="auto"/>
+        <w:spacing w:after="0" w:afterAutospacing="0" w:before="0" w:beforeAutospacing="0" w:line="480" w:lineRule="auto"/>
         <w:ind w:left="720" w:hanging="360"/>
         <w:rPr>
           <w:rFonts w:ascii="Times New Roman" w:cs="Times New Roman" w:eastAsia="Times New Roman" w:hAnsi="Times New Roman"/>
@@ -1896,7 +1645,7 @@
           <w:ilvl w:val="0"/>
           <w:numId w:val="1"/>
         </w:numPr>
-        <w:spacing w:after="0" w:afterAutospacing="0" w:before="0" w:beforeAutospacing="0" w:lineRule="auto"/>
+        <w:spacing w:after="0" w:afterAutospacing="0" w:before="0" w:beforeAutospacing="0" w:line="480" w:lineRule="auto"/>
         <w:ind w:left="720" w:hanging="360"/>
         <w:rPr>
           <w:rFonts w:ascii="Times New Roman" w:cs="Times New Roman" w:eastAsia="Times New Roman" w:hAnsi="Times New Roman"/>
@@ -1920,7 +1669,7 @@
           <w:ilvl w:val="0"/>
           <w:numId w:val="1"/>
         </w:numPr>
-        <w:spacing w:after="0" w:afterAutospacing="0" w:before="0" w:beforeAutospacing="0" w:lineRule="auto"/>
+        <w:spacing w:after="0" w:afterAutospacing="0" w:before="0" w:beforeAutospacing="0" w:line="480" w:lineRule="auto"/>
         <w:ind w:left="720" w:hanging="360"/>
         <w:rPr>
           <w:rFonts w:ascii="Times New Roman" w:cs="Times New Roman" w:eastAsia="Times New Roman" w:hAnsi="Times New Roman"/>
@@ -1944,7 +1693,7 @@
           <w:ilvl w:val="0"/>
           <w:numId w:val="1"/>
         </w:numPr>
-        <w:spacing w:after="240" w:before="0" w:beforeAutospacing="0" w:lineRule="auto"/>
+        <w:spacing w:after="240" w:before="0" w:beforeAutospacing="0" w:line="480" w:lineRule="auto"/>
         <w:ind w:left="720" w:hanging="360"/>
         <w:rPr>
           <w:rFonts w:ascii="Times New Roman" w:cs="Times New Roman" w:eastAsia="Times New Roman" w:hAnsi="Times New Roman"/>
@@ -1964,7 +1713,7 @@
     </w:p>
     <w:p>
       <w:pPr>
-        <w:spacing w:after="240" w:before="240" w:lineRule="auto"/>
+        <w:spacing w:after="240" w:before="240" w:line="480" w:lineRule="auto"/>
         <w:rPr>
           <w:rFonts w:ascii="Times New Roman" w:cs="Times New Roman" w:eastAsia="Times New Roman" w:hAnsi="Times New Roman"/>
           <w:sz w:val="24"/>
@@ -1982,7 +1731,7 @@
         <w:pStyle w:val="Heading2"/>
         <w:keepNext w:val="0"/>
         <w:keepLines w:val="0"/>
-        <w:spacing w:after="80" w:lineRule="auto"/>
+        <w:spacing w:after="80" w:line="480" w:lineRule="auto"/>
         <w:rPr>
           <w:rFonts w:ascii="Times New Roman" w:cs="Times New Roman" w:eastAsia="Times New Roman" w:hAnsi="Times New Roman"/>
           <w:sz w:val="22"/>
@@ -2003,7 +1752,7 @@
     </w:p>
     <w:p>
       <w:pPr>
-        <w:spacing w:after="240" w:before="240" w:lineRule="auto"/>
+        <w:spacing w:after="240" w:before="240" w:line="480" w:lineRule="auto"/>
         <w:rPr>
           <w:rFonts w:ascii="Times New Roman" w:cs="Times New Roman" w:eastAsia="Times New Roman" w:hAnsi="Times New Roman"/>
           <w:sz w:val="24"/>
@@ -2025,7 +1774,7 @@
         <w:pStyle w:val="Heading1"/>
         <w:keepNext w:val="0"/>
         <w:keepLines w:val="0"/>
-        <w:spacing w:after="80" w:lineRule="auto"/>
+        <w:spacing w:after="80" w:line="480" w:lineRule="auto"/>
         <w:rPr>
           <w:rFonts w:ascii="Times New Roman" w:cs="Times New Roman" w:eastAsia="Times New Roman" w:hAnsi="Times New Roman"/>
         </w:rPr>
@@ -2042,7 +1791,7 @@
     </w:p>
     <w:p>
       <w:pPr>
-        <w:spacing w:after="240" w:before="240" w:lineRule="auto"/>
+        <w:spacing w:after="240" w:before="240" w:line="480" w:lineRule="auto"/>
         <w:rPr>
           <w:rFonts w:ascii="Times New Roman" w:cs="Times New Roman" w:eastAsia="Times New Roman" w:hAnsi="Times New Roman"/>
           <w:sz w:val="24"/>
@@ -2061,7 +1810,7 @@
     </w:p>
     <w:p>
       <w:pPr>
-        <w:spacing w:after="240" w:before="240" w:lineRule="auto"/>
+        <w:spacing w:after="240" w:before="240" w:line="480" w:lineRule="auto"/>
         <w:rPr>
           <w:rFonts w:ascii="Times New Roman" w:cs="Times New Roman" w:eastAsia="Times New Roman" w:hAnsi="Times New Roman"/>
           <w:sz w:val="48"/>
@@ -2121,7 +1870,7 @@
           <w:p>
             <w:pPr>
               <w:widowControl w:val="0"/>
-              <w:spacing w:line="240" w:lineRule="auto"/>
+              <w:spacing w:line="480" w:lineRule="auto"/>
               <w:jc w:val="center"/>
               <w:rPr>
                 <w:rFonts w:ascii="Times New Roman" w:cs="Times New Roman" w:eastAsia="Times New Roman" w:hAnsi="Times New Roman"/>
@@ -2145,7 +1894,7 @@
           <w:p>
             <w:pPr>
               <w:widowControl w:val="0"/>
-              <w:spacing w:line="240" w:lineRule="auto"/>
+              <w:spacing w:line="480" w:lineRule="auto"/>
               <w:jc w:val="center"/>
               <w:rPr>
                 <w:rFonts w:ascii="Times New Roman" w:cs="Times New Roman" w:eastAsia="Times New Roman" w:hAnsi="Times New Roman"/>
@@ -2169,7 +1918,7 @@
           <w:p>
             <w:pPr>
               <w:widowControl w:val="0"/>
-              <w:spacing w:line="240" w:lineRule="auto"/>
+              <w:spacing w:line="480" w:lineRule="auto"/>
               <w:jc w:val="center"/>
               <w:rPr>
                 <w:rFonts w:ascii="Times New Roman" w:cs="Times New Roman" w:eastAsia="Times New Roman" w:hAnsi="Times New Roman"/>
@@ -2199,7 +1948,7 @@
           <w:p>
             <w:pPr>
               <w:widowControl w:val="0"/>
-              <w:spacing w:line="240" w:lineRule="auto"/>
+              <w:spacing w:line="480" w:lineRule="auto"/>
               <w:rPr>
                 <w:rFonts w:ascii="Times New Roman" w:cs="Times New Roman" w:eastAsia="Times New Roman" w:hAnsi="Times New Roman"/>
                 <w:sz w:val="36"/>
@@ -2222,7 +1971,7 @@
           <w:p>
             <w:pPr>
               <w:widowControl w:val="0"/>
-              <w:spacing w:line="240" w:lineRule="auto"/>
+              <w:spacing w:line="480" w:lineRule="auto"/>
               <w:rPr>
                 <w:rFonts w:ascii="Times New Roman" w:cs="Times New Roman" w:eastAsia="Times New Roman" w:hAnsi="Times New Roman"/>
                 <w:sz w:val="24"/>
@@ -2238,7 +1987,7 @@
           <w:p>
             <w:pPr>
               <w:widowControl w:val="0"/>
-              <w:spacing w:line="240" w:lineRule="auto"/>
+              <w:spacing w:line="480" w:lineRule="auto"/>
               <w:rPr>
                 <w:rFonts w:ascii="Times New Roman" w:cs="Times New Roman" w:eastAsia="Times New Roman" w:hAnsi="Times New Roman"/>
                 <w:sz w:val="24"/>
@@ -2261,7 +2010,7 @@
           <w:p>
             <w:pPr>
               <w:widowControl w:val="0"/>
-              <w:spacing w:after="240" w:before="240" w:line="240" w:lineRule="auto"/>
+              <w:spacing w:after="240" w:before="240" w:line="480" w:lineRule="auto"/>
               <w:rPr>
                 <w:rFonts w:ascii="Times New Roman" w:cs="Times New Roman" w:eastAsia="Times New Roman" w:hAnsi="Times New Roman"/>
                 <w:sz w:val="24"/>
@@ -2290,7 +2039,7 @@
           <w:p>
             <w:pPr>
               <w:widowControl w:val="0"/>
-              <w:spacing w:line="240" w:lineRule="auto"/>
+              <w:spacing w:line="480" w:lineRule="auto"/>
               <w:rPr>
                 <w:rFonts w:ascii="Times New Roman" w:cs="Times New Roman" w:eastAsia="Times New Roman" w:hAnsi="Times New Roman"/>
                 <w:sz w:val="36"/>
@@ -2313,7 +2062,7 @@
           <w:p>
             <w:pPr>
               <w:widowControl w:val="0"/>
-              <w:spacing w:line="240" w:lineRule="auto"/>
+              <w:spacing w:line="480" w:lineRule="auto"/>
               <w:rPr>
                 <w:rFonts w:ascii="Times New Roman" w:cs="Times New Roman" w:eastAsia="Times New Roman" w:hAnsi="Times New Roman"/>
                 <w:sz w:val="24"/>
@@ -2333,7 +2082,7 @@
           <w:p>
             <w:pPr>
               <w:widowControl w:val="0"/>
-              <w:spacing w:line="240" w:lineRule="auto"/>
+              <w:spacing w:line="480" w:lineRule="auto"/>
               <w:rPr>
                 <w:rFonts w:ascii="Times New Roman" w:cs="Times New Roman" w:eastAsia="Times New Roman" w:hAnsi="Times New Roman"/>
                 <w:sz w:val="24"/>
@@ -2356,7 +2105,7 @@
           <w:p>
             <w:pPr>
               <w:widowControl w:val="0"/>
-              <w:spacing w:line="240" w:lineRule="auto"/>
+              <w:spacing w:line="480" w:lineRule="auto"/>
               <w:rPr>
                 <w:rFonts w:ascii="Times New Roman" w:cs="Times New Roman" w:eastAsia="Times New Roman" w:hAnsi="Times New Roman"/>
                 <w:sz w:val="24"/>
@@ -2385,7 +2134,7 @@
           <w:p>
             <w:pPr>
               <w:widowControl w:val="0"/>
-              <w:spacing w:line="240" w:lineRule="auto"/>
+              <w:spacing w:line="480" w:lineRule="auto"/>
               <w:rPr>
                 <w:rFonts w:ascii="Times New Roman" w:cs="Times New Roman" w:eastAsia="Times New Roman" w:hAnsi="Times New Roman"/>
                 <w:sz w:val="36"/>
@@ -2408,7 +2157,7 @@
           <w:p>
             <w:pPr>
               <w:widowControl w:val="0"/>
-              <w:spacing w:line="240" w:lineRule="auto"/>
+              <w:spacing w:line="480" w:lineRule="auto"/>
               <w:rPr>
                 <w:rFonts w:ascii="Times New Roman" w:cs="Times New Roman" w:eastAsia="Times New Roman" w:hAnsi="Times New Roman"/>
                 <w:sz w:val="24"/>
@@ -2431,7 +2180,7 @@
           <w:p>
             <w:pPr>
               <w:widowControl w:val="0"/>
-              <w:spacing w:line="240" w:lineRule="auto"/>
+              <w:spacing w:line="480" w:lineRule="auto"/>
               <w:rPr>
                 <w:rFonts w:ascii="Times New Roman" w:cs="Times New Roman" w:eastAsia="Times New Roman" w:hAnsi="Times New Roman"/>
                 <w:sz w:val="24"/>
@@ -2460,7 +2209,7 @@
           <w:p>
             <w:pPr>
               <w:widowControl w:val="0"/>
-              <w:spacing w:line="240" w:lineRule="auto"/>
+              <w:spacing w:line="480" w:lineRule="auto"/>
               <w:rPr>
                 <w:rFonts w:ascii="Times New Roman" w:cs="Times New Roman" w:eastAsia="Times New Roman" w:hAnsi="Times New Roman"/>
                 <w:sz w:val="36"/>
@@ -2483,7 +2232,7 @@
           <w:p>
             <w:pPr>
               <w:widowControl w:val="0"/>
-              <w:spacing w:line="240" w:lineRule="auto"/>
+              <w:spacing w:line="480" w:lineRule="auto"/>
               <w:rPr>
                 <w:rFonts w:ascii="Times New Roman" w:cs="Times New Roman" w:eastAsia="Times New Roman" w:hAnsi="Times New Roman"/>
                 <w:sz w:val="24"/>
@@ -2506,7 +2255,7 @@
           <w:p>
             <w:pPr>
               <w:widowControl w:val="0"/>
-              <w:spacing w:line="240" w:lineRule="auto"/>
+              <w:spacing w:line="480" w:lineRule="auto"/>
               <w:rPr>
                 <w:rFonts w:ascii="Times New Roman" w:cs="Times New Roman" w:eastAsia="Times New Roman" w:hAnsi="Times New Roman"/>
                 <w:sz w:val="24"/>
@@ -2535,7 +2284,7 @@
           <w:p>
             <w:pPr>
               <w:widowControl w:val="0"/>
-              <w:spacing w:line="240" w:lineRule="auto"/>
+              <w:spacing w:line="480" w:lineRule="auto"/>
               <w:rPr>
                 <w:rFonts w:ascii="Times New Roman" w:cs="Times New Roman" w:eastAsia="Times New Roman" w:hAnsi="Times New Roman"/>
                 <w:sz w:val="36"/>
@@ -2558,7 +2307,7 @@
           <w:p>
             <w:pPr>
               <w:widowControl w:val="0"/>
-              <w:spacing w:line="240" w:lineRule="auto"/>
+              <w:spacing w:line="480" w:lineRule="auto"/>
               <w:rPr>
                 <w:rFonts w:ascii="Times New Roman" w:cs="Times New Roman" w:eastAsia="Times New Roman" w:hAnsi="Times New Roman"/>
                 <w:sz w:val="24"/>
@@ -2581,7 +2330,7 @@
           <w:p>
             <w:pPr>
               <w:widowControl w:val="0"/>
-              <w:spacing w:line="240" w:lineRule="auto"/>
+              <w:spacing w:line="480" w:lineRule="auto"/>
               <w:rPr>
                 <w:rFonts w:ascii="Times New Roman" w:cs="Times New Roman" w:eastAsia="Times New Roman" w:hAnsi="Times New Roman"/>
                 <w:sz w:val="24"/>
@@ -2610,7 +2359,7 @@
           <w:p>
             <w:pPr>
               <w:widowControl w:val="0"/>
-              <w:spacing w:line="240" w:lineRule="auto"/>
+              <w:spacing w:line="480" w:lineRule="auto"/>
               <w:rPr>
                 <w:rFonts w:ascii="Times New Roman" w:cs="Times New Roman" w:eastAsia="Times New Roman" w:hAnsi="Times New Roman"/>
                 <w:sz w:val="36"/>
@@ -2633,7 +2382,7 @@
           <w:p>
             <w:pPr>
               <w:widowControl w:val="0"/>
-              <w:spacing w:line="240" w:lineRule="auto"/>
+              <w:spacing w:line="480" w:lineRule="auto"/>
               <w:rPr>
                 <w:rFonts w:ascii="Times New Roman" w:cs="Times New Roman" w:eastAsia="Times New Roman" w:hAnsi="Times New Roman"/>
                 <w:sz w:val="24"/>
@@ -2656,7 +2405,7 @@
           <w:p>
             <w:pPr>
               <w:widowControl w:val="0"/>
-              <w:spacing w:line="240" w:lineRule="auto"/>
+              <w:spacing w:line="480" w:lineRule="auto"/>
               <w:rPr>
                 <w:rFonts w:ascii="Times New Roman" w:cs="Times New Roman" w:eastAsia="Times New Roman" w:hAnsi="Times New Roman"/>
                 <w:sz w:val="24"/>
@@ -2685,7 +2434,7 @@
           <w:p>
             <w:pPr>
               <w:widowControl w:val="0"/>
-              <w:spacing w:line="240" w:lineRule="auto"/>
+              <w:spacing w:line="480" w:lineRule="auto"/>
               <w:rPr>
                 <w:rFonts w:ascii="Times New Roman" w:cs="Times New Roman" w:eastAsia="Times New Roman" w:hAnsi="Times New Roman"/>
                 <w:sz w:val="36"/>
@@ -2708,7 +2457,7 @@
           <w:p>
             <w:pPr>
               <w:widowControl w:val="0"/>
-              <w:spacing w:line="240" w:lineRule="auto"/>
+              <w:spacing w:line="480" w:lineRule="auto"/>
               <w:rPr>
                 <w:rFonts w:ascii="Times New Roman" w:cs="Times New Roman" w:eastAsia="Times New Roman" w:hAnsi="Times New Roman"/>
                 <w:sz w:val="24"/>
@@ -2731,7 +2480,7 @@
           <w:p>
             <w:pPr>
               <w:widowControl w:val="0"/>
-              <w:spacing w:line="240" w:lineRule="auto"/>
+              <w:spacing w:line="480" w:lineRule="auto"/>
               <w:rPr>
                 <w:rFonts w:ascii="Times New Roman" w:cs="Times New Roman" w:eastAsia="Times New Roman" w:hAnsi="Times New Roman"/>
                 <w:sz w:val="24"/>
@@ -2753,7 +2502,7 @@
     </w:tbl>
     <w:p>
       <w:pPr>
-        <w:spacing w:after="240" w:before="240" w:lineRule="auto"/>
+        <w:spacing w:after="240" w:before="240" w:line="480" w:lineRule="auto"/>
         <w:rPr>
           <w:rFonts w:ascii="Times New Roman" w:cs="Times New Roman" w:eastAsia="Times New Roman" w:hAnsi="Times New Roman"/>
           <w:sz w:val="48"/>
@@ -2770,7 +2519,7 @@
       <w:pPr>
         <w:pStyle w:val="Heading1"/>
         <w:shd w:fill="ffffff" w:val="clear"/>
-        <w:spacing w:after="80" w:lineRule="auto"/>
+        <w:spacing w:after="80" w:line="480" w:lineRule="auto"/>
         <w:rPr/>
       </w:pPr>
       <w:bookmarkStart w:colFirst="0" w:colLast="0" w:name="_x9dpircebifw" w:id="13"/>
@@ -2785,7 +2534,7 @@
     <w:p>
       <w:pPr>
         <w:shd w:fill="ffffff" w:val="clear"/>
-        <w:spacing w:after="240" w:before="240" w:lineRule="auto"/>
+        <w:spacing w:after="240" w:before="240" w:line="480" w:lineRule="auto"/>
         <w:rPr/>
       </w:pPr>
       <w:r>
@@ -2798,7 +2547,7 @@
     <w:p>
       <w:pPr>
         <w:shd w:fill="ffffff" w:val="clear"/>
-        <w:spacing w:after="240" w:before="240" w:lineRule="auto"/>
+        <w:spacing w:after="240" w:before="240" w:line="480" w:lineRule="auto"/>
         <w:rPr/>
       </w:pPr>
       <w:r>
@@ -2806,13 +2555,27 @@
           <w:rtl w:val="0"/>
         </w:rPr>
         <w:t xml:space="preserve">Bootstrap facilita el diseño del sitio gracias a sus componentes ya preparados, como botones, tarjetas, menús de navegación y carruseles.</w:t>
+      </w:r>
+      <w:r>
+        <w:rPr>
+          <w:b w:val="1"/>
+          <w:bCs w:val="1"/>
+          <w:rtl w:val="0"/>
+        </w:rPr>
+        <w:t xml:space="preserve">(Bootstrap Team, 2025)</w:t>
+      </w:r>
+      <w:r>
+        <w:rPr>
+          <w:rtl w:val="0"/>
+        </w:rPr>
+        <w:t xml:space="preserve">. </w:t>
       </w:r>
     </w:p>
     <w:p>
       <w:pPr>
         <w:pStyle w:val="Heading2"/>
         <w:shd w:fill="ffffff" w:val="clear"/>
-        <w:spacing w:after="80" w:lineRule="auto"/>
+        <w:spacing w:after="80" w:line="480" w:lineRule="auto"/>
         <w:rPr/>
       </w:pPr>
       <w:bookmarkStart w:colFirst="0" w:colLast="0" w:name="_lner52md8g8h" w:id="14"/>
@@ -2827,7 +2590,7 @@
     <w:p>
       <w:pPr>
         <w:shd w:fill="ffffff" w:val="clear"/>
-        <w:spacing w:after="240" w:before="240" w:lineRule="auto"/>
+        <w:spacing w:after="240" w:before="240" w:line="480" w:lineRule="auto"/>
         <w:rPr/>
       </w:pPr>
       <w:r>
@@ -2841,10 +2604,10 @@
       <w:pPr>
         <w:numPr>
           <w:ilvl w:val="0"/>
-          <w:numId w:val="4"/>
+          <w:numId w:val="3"/>
         </w:numPr>
         <w:shd w:fill="ffffff" w:val="clear"/>
-        <w:spacing w:after="0" w:afterAutospacing="0" w:before="240" w:lineRule="auto"/>
+        <w:spacing w:after="0" w:afterAutospacing="0" w:before="240" w:line="480" w:lineRule="auto"/>
         <w:ind w:left="720" w:hanging="360"/>
       </w:pPr>
       <w:r>
@@ -2858,10 +2621,10 @@
       <w:pPr>
         <w:numPr>
           <w:ilvl w:val="0"/>
-          <w:numId w:val="4"/>
+          <w:numId w:val="3"/>
         </w:numPr>
         <w:shd w:fill="ffffff" w:val="clear"/>
-        <w:spacing w:after="0" w:afterAutospacing="0" w:before="0" w:beforeAutospacing="0" w:lineRule="auto"/>
+        <w:spacing w:after="0" w:afterAutospacing="0" w:before="0" w:beforeAutospacing="0" w:line="480" w:lineRule="auto"/>
         <w:ind w:left="720" w:hanging="360"/>
       </w:pPr>
       <w:r>
@@ -2875,10 +2638,10 @@
       <w:pPr>
         <w:numPr>
           <w:ilvl w:val="0"/>
-          <w:numId w:val="4"/>
+          <w:numId w:val="3"/>
         </w:numPr>
         <w:shd w:fill="ffffff" w:val="clear"/>
-        <w:spacing w:after="0" w:afterAutospacing="0" w:before="0" w:beforeAutospacing="0" w:lineRule="auto"/>
+        <w:spacing w:after="0" w:afterAutospacing="0" w:before="0" w:beforeAutospacing="0" w:line="480" w:lineRule="auto"/>
         <w:ind w:left="720" w:hanging="360"/>
       </w:pPr>
       <w:r>
@@ -2892,10 +2655,10 @@
       <w:pPr>
         <w:numPr>
           <w:ilvl w:val="0"/>
-          <w:numId w:val="4"/>
+          <w:numId w:val="3"/>
         </w:numPr>
         <w:shd w:fill="ffffff" w:val="clear"/>
-        <w:spacing w:after="0" w:afterAutospacing="0" w:before="0" w:beforeAutospacing="0" w:lineRule="auto"/>
+        <w:spacing w:after="0" w:afterAutospacing="0" w:before="0" w:beforeAutospacing="0" w:line="480" w:lineRule="auto"/>
         <w:ind w:left="720" w:hanging="360"/>
       </w:pPr>
       <w:r>
@@ -2909,10 +2672,10 @@
       <w:pPr>
         <w:numPr>
           <w:ilvl w:val="0"/>
-          <w:numId w:val="4"/>
+          <w:numId w:val="3"/>
         </w:numPr>
         <w:shd w:fill="ffffff" w:val="clear"/>
-        <w:spacing w:after="240" w:before="0" w:beforeAutospacing="0" w:lineRule="auto"/>
+        <w:spacing w:after="240" w:before="0" w:beforeAutospacing="0" w:line="480" w:lineRule="auto"/>
         <w:ind w:left="720" w:hanging="360"/>
       </w:pPr>
       <w:r>
@@ -2928,7 +2691,7 @@
         <w:keepNext w:val="0"/>
         <w:keepLines w:val="0"/>
         <w:shd w:fill="ffffff" w:val="clear"/>
-        <w:spacing w:after="80" w:lineRule="auto"/>
+        <w:spacing w:after="80" w:line="480" w:lineRule="auto"/>
         <w:rPr>
           <w:rFonts w:ascii="Times New Roman" w:cs="Times New Roman" w:eastAsia="Times New Roman" w:hAnsi="Times New Roman"/>
         </w:rPr>
@@ -2946,7 +2709,7 @@
     <w:p>
       <w:pPr>
         <w:shd w:fill="ffffff" w:val="clear"/>
-        <w:spacing w:after="240" w:before="240" w:lineRule="auto"/>
+        <w:spacing w:after="240" w:before="240" w:line="480" w:lineRule="auto"/>
         <w:rPr>
           <w:rFonts w:ascii="Times New Roman" w:cs="Times New Roman" w:eastAsia="Times New Roman" w:hAnsi="Times New Roman"/>
         </w:rPr>
@@ -2965,7 +2728,7 @@
         <w:keepNext w:val="0"/>
         <w:keepLines w:val="0"/>
         <w:shd w:fill="ffffff" w:val="clear"/>
-        <w:spacing w:before="280" w:lineRule="auto"/>
+        <w:spacing w:before="280" w:line="480" w:lineRule="auto"/>
         <w:rPr>
           <w:rFonts w:ascii="Times New Roman" w:cs="Times New Roman" w:eastAsia="Times New Roman" w:hAnsi="Times New Roman"/>
           <w:b w:val="1"/>
@@ -2993,7 +2756,7 @@
     <w:p>
       <w:pPr>
         <w:shd w:fill="ffffff" w:val="clear"/>
-        <w:spacing w:after="240" w:before="240" w:lineRule="auto"/>
+        <w:spacing w:after="240" w:before="240" w:line="480" w:lineRule="auto"/>
         <w:rPr>
           <w:rFonts w:ascii="Times New Roman" w:cs="Times New Roman" w:eastAsia="Times New Roman" w:hAnsi="Times New Roman"/>
         </w:rPr>
@@ -3012,7 +2775,7 @@
         <w:keepNext w:val="0"/>
         <w:keepLines w:val="0"/>
         <w:shd w:fill="ffffff" w:val="clear"/>
-        <w:spacing w:before="280" w:lineRule="auto"/>
+        <w:spacing w:before="280" w:line="480" w:lineRule="auto"/>
         <w:rPr>
           <w:rFonts w:ascii="Times New Roman" w:cs="Times New Roman" w:eastAsia="Times New Roman" w:hAnsi="Times New Roman"/>
           <w:b w:val="1"/>
@@ -3040,7 +2803,7 @@
     <w:p>
       <w:pPr>
         <w:shd w:fill="ffffff" w:val="clear"/>
-        <w:spacing w:after="240" w:before="240" w:lineRule="auto"/>
+        <w:spacing w:after="240" w:before="240" w:line="480" w:lineRule="auto"/>
         <w:rPr>
           <w:rFonts w:ascii="Times New Roman" w:cs="Times New Roman" w:eastAsia="Times New Roman" w:hAnsi="Times New Roman"/>
         </w:rPr>
@@ -3059,7 +2822,7 @@
         <w:keepNext w:val="0"/>
         <w:keepLines w:val="0"/>
         <w:shd w:fill="ffffff" w:val="clear"/>
-        <w:spacing w:before="280" w:lineRule="auto"/>
+        <w:spacing w:before="280" w:line="480" w:lineRule="auto"/>
         <w:rPr>
           <w:rFonts w:ascii="Times New Roman" w:cs="Times New Roman" w:eastAsia="Times New Roman" w:hAnsi="Times New Roman"/>
           <w:b w:val="1"/>
@@ -3087,7 +2850,7 @@
     <w:p>
       <w:pPr>
         <w:shd w:fill="ffffff" w:val="clear"/>
-        <w:spacing w:after="240" w:before="240" w:lineRule="auto"/>
+        <w:spacing w:after="240" w:before="240" w:line="480" w:lineRule="auto"/>
         <w:rPr>
           <w:rFonts w:ascii="Times New Roman" w:cs="Times New Roman" w:eastAsia="Times New Roman" w:hAnsi="Times New Roman"/>
         </w:rPr>
@@ -3106,7 +2869,7 @@
         <w:keepNext w:val="0"/>
         <w:keepLines w:val="0"/>
         <w:shd w:fill="ffffff" w:val="clear"/>
-        <w:spacing w:before="280" w:lineRule="auto"/>
+        <w:spacing w:before="280" w:line="480" w:lineRule="auto"/>
         <w:rPr>
           <w:rFonts w:ascii="Times New Roman" w:cs="Times New Roman" w:eastAsia="Times New Roman" w:hAnsi="Times New Roman"/>
           <w:b w:val="1"/>
@@ -3134,7 +2897,7 @@
     <w:p>
       <w:pPr>
         <w:shd w:fill="ffffff" w:val="clear"/>
-        <w:spacing w:after="240" w:before="240" w:lineRule="auto"/>
+        <w:spacing w:after="240" w:before="240" w:line="480" w:lineRule="auto"/>
         <w:rPr>
           <w:rFonts w:ascii="Times New Roman" w:cs="Times New Roman" w:eastAsia="Times New Roman" w:hAnsi="Times New Roman"/>
         </w:rPr>
@@ -3153,7 +2916,7 @@
         <w:keepNext w:val="0"/>
         <w:keepLines w:val="0"/>
         <w:shd w:fill="ffffff" w:val="clear"/>
-        <w:spacing w:before="280" w:lineRule="auto"/>
+        <w:spacing w:before="280" w:line="480" w:lineRule="auto"/>
         <w:rPr>
           <w:rFonts w:ascii="Times New Roman" w:cs="Times New Roman" w:eastAsia="Times New Roman" w:hAnsi="Times New Roman"/>
           <w:b w:val="1"/>
@@ -3181,7 +2944,7 @@
     <w:p>
       <w:pPr>
         <w:shd w:fill="ffffff" w:val="clear"/>
-        <w:spacing w:after="240" w:before="240" w:lineRule="auto"/>
+        <w:spacing w:after="240" w:before="240" w:line="480" w:lineRule="auto"/>
         <w:rPr>
           <w:rFonts w:ascii="Times New Roman" w:cs="Times New Roman" w:eastAsia="Times New Roman" w:hAnsi="Times New Roman"/>
         </w:rPr>
@@ -3192,6 +2955,22 @@
           <w:rtl w:val="0"/>
         </w:rPr>
         <w:t xml:space="preserve">Se usarán para guardar avances del proyecto y trabajar de forma organizada en equipo.</w:t>
+      </w:r>
+      <w:r>
+        <w:rPr>
+          <w:rFonts w:ascii="Times New Roman" w:cs="Times New Roman" w:eastAsia="Times New Roman" w:hAnsi="Times New Roman"/>
+          <w:b w:val="1"/>
+          <w:bCs w:val="1"/>
+          <w:rtl w:val="0"/>
+        </w:rPr>
+        <w:t xml:space="preserve">(GitHub, 2025)</w:t>
+      </w:r>
+      <w:r>
+        <w:rPr>
+          <w:rFonts w:ascii="Times New Roman" w:cs="Times New Roman" w:eastAsia="Times New Roman" w:hAnsi="Times New Roman"/>
+          <w:rtl w:val="0"/>
+        </w:rPr>
+        <w:t xml:space="preserve">. </w:t>
       </w:r>
     </w:p>
     <w:p>
@@ -3200,7 +2979,7 @@
         <w:keepNext w:val="0"/>
         <w:keepLines w:val="0"/>
         <w:shd w:fill="ffffff" w:val="clear"/>
-        <w:spacing w:after="80" w:lineRule="auto"/>
+        <w:spacing w:after="80" w:line="480" w:lineRule="auto"/>
         <w:rPr/>
       </w:pPr>
       <w:bookmarkStart w:colFirst="0" w:colLast="0" w:name="_guzaopbg9k0a" w:id="21"/>
@@ -3215,6 +2994,7 @@
     <w:p>
       <w:pPr>
         <w:shd w:fill="ffffff" w:val="clear"/>
+        <w:spacing w:line="480" w:lineRule="auto"/>
         <w:rPr/>
       </w:pPr>
       <w:r>
@@ -3225,7 +3005,7 @@
     </w:p>
     <w:p>
       <w:pPr>
-        <w:spacing w:after="240" w:before="240" w:lineRule="auto"/>
+        <w:spacing w:after="240" w:before="240" w:line="480" w:lineRule="auto"/>
         <w:rPr>
           <w:rFonts w:ascii="Times New Roman" w:cs="Times New Roman" w:eastAsia="Times New Roman" w:hAnsi="Times New Roman"/>
           <w:sz w:val="48"/>
@@ -3240,6 +3020,7 @@
     </w:p>
     <w:p>
       <w:pPr>
+        <w:spacing w:line="480" w:lineRule="auto"/>
         <w:rPr/>
       </w:pPr>
       <w:r>
@@ -3254,7 +3035,7 @@
         <w:pStyle w:val="Heading1"/>
         <w:keepNext w:val="0"/>
         <w:keepLines w:val="0"/>
-        <w:spacing w:after="80" w:lineRule="auto"/>
+        <w:spacing w:after="80" w:line="480" w:lineRule="auto"/>
         <w:rPr/>
       </w:pPr>
       <w:bookmarkStart w:colFirst="0" w:colLast="0" w:name="_sa26ku9s0jm0" w:id="22"/>
@@ -3268,6 +3049,7 @@
     </w:p>
     <w:p>
       <w:pPr>
+        <w:spacing w:line="480" w:lineRule="auto"/>
         <w:rPr/>
       </w:pPr>
       <w:r>
@@ -3275,331 +3057,6 @@
           <w:rtl w:val="0"/>
         </w:rPr>
         <w:t xml:space="preserve">El aplicativo contará con:</w:t>
-      </w:r>
-    </w:p>
-    <w:p>
-      <w:pPr>
-        <w:numPr>
-          <w:ilvl w:val="0"/>
-          <w:numId w:val="3"/>
-        </w:numPr>
-        <w:ind w:left="720" w:hanging="360"/>
-      </w:pPr>
-      <w:r>
-        <w:rPr>
-          <w:rtl w:val="0"/>
-        </w:rPr>
-        <w:t xml:space="preserve">Menú de navegación.</w:t>
-      </w:r>
-    </w:p>
-    <w:p>
-      <w:pPr>
-        <w:numPr>
-          <w:ilvl w:val="0"/>
-          <w:numId w:val="3"/>
-        </w:numPr>
-        <w:ind w:left="720" w:hanging="360"/>
-      </w:pPr>
-      <w:r>
-        <w:rPr>
-          <w:rtl w:val="0"/>
-        </w:rPr>
-        <w:t xml:space="preserve">Tarjetas interactivas.</w:t>
-      </w:r>
-    </w:p>
-    <w:p>
-      <w:pPr>
-        <w:numPr>
-          <w:ilvl w:val="0"/>
-          <w:numId w:val="3"/>
-        </w:numPr>
-        <w:ind w:left="720" w:hanging="360"/>
-      </w:pPr>
-      <w:r>
-        <w:rPr>
-          <w:rtl w:val="0"/>
-        </w:rPr>
-        <w:t xml:space="preserve">Carrusel de imágenes.</w:t>
-      </w:r>
-    </w:p>
-    <w:p>
-      <w:pPr>
-        <w:numPr>
-          <w:ilvl w:val="0"/>
-          <w:numId w:val="3"/>
-        </w:numPr>
-        <w:ind w:left="720" w:hanging="360"/>
-      </w:pPr>
-      <w:r>
-        <w:rPr>
-          <w:rtl w:val="0"/>
-        </w:rPr>
-        <w:t xml:space="preserve">Secciones organizadas.</w:t>
-      </w:r>
-    </w:p>
-    <w:p>
-      <w:pPr>
-        <w:numPr>
-          <w:ilvl w:val="0"/>
-          <w:numId w:val="3"/>
-        </w:numPr>
-        <w:ind w:left="720" w:hanging="360"/>
-      </w:pPr>
-      <w:r>
-        <w:rPr>
-          <w:rtl w:val="0"/>
-        </w:rPr>
-        <w:t xml:space="preserve">Diseño responsive.</w:t>
-      </w:r>
-    </w:p>
-    <w:p>
-      <w:pPr>
-        <w:numPr>
-          <w:ilvl w:val="0"/>
-          <w:numId w:val="3"/>
-        </w:numPr>
-        <w:ind w:left="720" w:hanging="360"/>
-      </w:pPr>
-      <w:r>
-        <w:rPr>
-          <w:rtl w:val="0"/>
-        </w:rPr>
-        <w:t xml:space="preserve">Efectos visuales.</w:t>
-      </w:r>
-    </w:p>
-    <w:p>
-      <w:pPr>
-        <w:numPr>
-          <w:ilvl w:val="0"/>
-          <w:numId w:val="3"/>
-        </w:numPr>
-        <w:ind w:left="720" w:hanging="360"/>
-      </w:pPr>
-      <w:r>
-        <w:rPr>
-          <w:rtl w:val="0"/>
-        </w:rPr>
-        <w:t xml:space="preserve">Contenido dinámico.</w:t>
-      </w:r>
-    </w:p>
-    <w:p>
-      <w:pPr>
-        <w:pStyle w:val="Heading1"/>
-        <w:keepNext w:val="0"/>
-        <w:keepLines w:val="0"/>
-        <w:spacing w:after="80" w:lineRule="auto"/>
-        <w:rPr/>
-      </w:pPr>
-      <w:bookmarkStart w:colFirst="0" w:colLast="0" w:name="_8h9udn8qyc3n" w:id="23"/>
-      <w:bookmarkEnd w:id="23"/>
-      <w:r>
-        <w:rPr>
-          <w:rtl w:val="0"/>
-        </w:rPr>
-        <w:t xml:space="preserve">Conclusiones</w:t>
-      </w:r>
-    </w:p>
-    <w:p>
-      <w:pPr>
-        <w:rPr/>
-      </w:pPr>
-      <w:r>
-        <w:rPr>
-          <w:rtl w:val="0"/>
-        </w:rPr>
-        <w:t xml:space="preserve">Gracias a este proyecto aprendimos sobre tecnologías modernas de desarrollo web, el funcionamiento de los frameworks y la importancia de organizar correctamente un proyecto.</w:t>
-      </w:r>
-    </w:p>
-    <w:p>
-      <w:pPr>
-        <w:rPr/>
-      </w:pPr>
-      <w:r>
-        <w:rPr>
-          <w:rtl w:val="0"/>
-        </w:rPr>
-        <w:t xml:space="preserve">También comprendimos la diferencia entre frontend y backend, además de aprender a utilizar herramientas como Bootstrap, Git y GitHub para crear aplicaciones web modernas y organizadas.</w:t>
-      </w:r>
-    </w:p>
-    <w:p>
-      <w:pPr>
-        <w:rPr>
-          <w:rFonts w:ascii="Times New Roman" w:cs="Times New Roman" w:eastAsia="Times New Roman" w:hAnsi="Times New Roman"/>
-          <w:sz w:val="48"/>
-          <w:szCs w:val="48"/>
-        </w:rPr>
-      </w:pPr>
-      <w:r>
-        <w:rPr>
-          <w:rtl w:val="0"/>
-        </w:rPr>
-      </w:r>
-    </w:p>
-    <w:p>
-      <w:pPr>
-        <w:spacing w:line="240" w:lineRule="auto"/>
-        <w:ind w:left="90" w:firstLine="0"/>
-        <w:jc w:val="center"/>
-        <w:rPr>
-          <w:rFonts w:ascii="Times New Roman" w:cs="Times New Roman" w:eastAsia="Times New Roman" w:hAnsi="Times New Roman"/>
-          <w:b w:val="1"/>
-          <w:bCs w:val="1"/>
-          <w:sz w:val="24"/>
-          <w:szCs w:val="24"/>
-        </w:rPr>
-      </w:pPr>
-      <w:r>
-        <w:rPr>
-          <w:rtl w:val="0"/>
-        </w:rPr>
-      </w:r>
-    </w:p>
-    <w:p>
-      <w:pPr>
-        <w:spacing w:line="240" w:lineRule="auto"/>
-        <w:ind w:left="90" w:firstLine="0"/>
-        <w:jc w:val="center"/>
-        <w:rPr>
-          <w:rFonts w:ascii="Times New Roman" w:cs="Times New Roman" w:eastAsia="Times New Roman" w:hAnsi="Times New Roman"/>
-          <w:b w:val="1"/>
-          <w:bCs w:val="1"/>
-          <w:sz w:val="24"/>
-          <w:szCs w:val="24"/>
-        </w:rPr>
-      </w:pPr>
-      <w:r>
-        <w:rPr>
-          <w:rtl w:val="0"/>
-        </w:rPr>
-      </w:r>
-    </w:p>
-    <w:p>
-      <w:pPr>
-        <w:spacing w:line="240" w:lineRule="auto"/>
-        <w:ind w:left="90" w:firstLine="0"/>
-        <w:jc w:val="center"/>
-        <w:rPr>
-          <w:rFonts w:ascii="Times New Roman" w:cs="Times New Roman" w:eastAsia="Times New Roman" w:hAnsi="Times New Roman"/>
-          <w:b w:val="1"/>
-          <w:bCs w:val="1"/>
-          <w:sz w:val="24"/>
-          <w:szCs w:val="24"/>
-        </w:rPr>
-        <w:sectPr>
-          <w:type w:val="nextPage"/>
-          <w:pgSz w:h="16834" w:w="11909" w:orient="portrait"/>
-          <w:pgMar w:bottom="1440.0000000000002" w:top="1440.0000000000002" w:left="1440.0000000000002" w:right="1440.0000000000002" w:header="720" w:footer="720"/>
-          <w:pgNumType w:start="1"/>
-        </w:sectPr>
-      </w:pPr>
-      <w:r>
-        <w:rPr>
-          <w:rtl w:val="0"/>
-        </w:rPr>
-      </w:r>
-    </w:p>
-    <w:p>
-      <w:pPr>
-        <w:pStyle w:val="Title"/>
-        <w:keepNext w:val="0"/>
-        <w:keepLines w:val="0"/>
-        <w:pageBreakBefore w:val="0"/>
-        <w:widowControl w:val="0"/>
-        <w:pBdr>
-          <w:top w:space="0" w:sz="0" w:val="nil"/>
-          <w:left w:space="0" w:sz="0" w:val="nil"/>
-          <w:bottom w:space="0" w:sz="0" w:val="nil"/>
-          <w:right w:space="0" w:sz="0" w:val="nil"/>
-          <w:between w:space="0" w:sz="0" w:val="nil"/>
-        </w:pBdr>
-        <w:shd w:fill="auto" w:val="clear"/>
-        <w:spacing w:after="0" w:before="0" w:line="276" w:lineRule="auto"/>
-        <w:ind w:left="0" w:right="0" w:firstLine="0"/>
-        <w:jc w:val="left"/>
-        <w:rPr>
-          <w:rFonts w:ascii="Times New Roman" w:cs="Times New Roman" w:eastAsia="Times New Roman" w:hAnsi="Times New Roman"/>
-          <w:b w:val="1"/>
-          <w:bCs w:val="1"/>
-          <w:sz w:val="24"/>
-          <w:szCs w:val="24"/>
-        </w:rPr>
-        <w:sectPr>
-          <w:type w:val="nextPage"/>
-          <w:pgSz w:h="16834" w:w="11909" w:orient="portrait"/>
-          <w:pgMar w:bottom="1440.0000000000002" w:top="1440.0000000000002" w:left="1440.0000000000002" w:right="1440.0000000000002" w:header="720" w:footer="720"/>
-          <w:pgNumType w:start="1"/>
-        </w:sectPr>
-      </w:pPr>
-      <w:bookmarkStart w:colFirst="0" w:colLast="0" w:name="_j409k5ufvopw" w:id="24"/>
-      <w:bookmarkEnd w:id="24"/>
-      <w:r>
-        <w:rPr>
-          <w:rFonts w:ascii="Arial" w:cs="Arial" w:eastAsia="Arial" w:hAnsi="Arial"/>
-          <w:b w:val="0"/>
-          <w:bCs w:val="0"/>
-          <w:i w:val="0"/>
-          <w:iCs w:val="0"/>
-          <w:smallCaps w:val="0"/>
-          <w:strike w:val="0"/>
-          <w:color w:val="000000"/>
-          <w:sz w:val="52"/>
-          <w:szCs w:val="52"/>
-          <w:u w:val="none"/>
-          <w:shd w:fill="auto" w:val="clear"/>
-          <w:vertAlign w:val="baseline"/>
-          <w:rtl w:val="0"/>
-        </w:rPr>
-        <w:t xml:space="preserve">Pestaña 3</w:t>
-      </w:r>
-      <w:r>
-        <w:rPr>
-          <w:rtl w:val="0"/>
-        </w:rPr>
-      </w:r>
-    </w:p>
-    <w:p>
-      <w:pPr>
-        <w:pStyle w:val="Heading3"/>
-        <w:keepNext w:val="0"/>
-        <w:keepLines w:val="0"/>
-        <w:spacing w:before="280" w:lineRule="auto"/>
-        <w:rPr>
-          <w:b w:val="1"/>
-          <w:bCs w:val="1"/>
-          <w:color w:val="000000"/>
-          <w:sz w:val="26"/>
-          <w:szCs w:val="26"/>
-        </w:rPr>
-      </w:pPr>
-      <w:bookmarkStart w:colFirst="0" w:colLast="0" w:name="_e9vtp864in1k" w:id="25"/>
-      <w:bookmarkEnd w:id="25"/>
-      <w:r>
-        <w:rPr>
-          <w:b w:val="1"/>
-          <w:bCs w:val="1"/>
-          <w:color w:val="000000"/>
-          <w:sz w:val="26"/>
-          <w:szCs w:val="26"/>
-          <w:rtl w:val="0"/>
-        </w:rPr>
-        <w:t xml:space="preserve">Bootstrap (la opción más fácil)</w:t>
-      </w:r>
-    </w:p>
-    <w:p>
-      <w:pPr>
-        <w:spacing w:after="240" w:before="240" w:lineRule="auto"/>
-        <w:rPr>
-          <w:b w:val="1"/>
-          <w:bCs w:val="1"/>
-        </w:rPr>
-      </w:pPr>
-      <w:r>
-        <w:rPr>
-          <w:b w:val="1"/>
-          <w:bCs w:val="1"/>
-          <w:rtl w:val="0"/>
-        </w:rPr>
-        <w:t xml:space="preserve">¿Por qué?</w:t>
       </w:r>
     </w:p>
     <w:p>
@@ -3608,14 +3065,14 @@
           <w:ilvl w:val="0"/>
           <w:numId w:val="2"/>
         </w:numPr>
-        <w:spacing w:after="0" w:afterAutospacing="0" w:before="240" w:lineRule="auto"/>
+        <w:spacing w:line="480" w:lineRule="auto"/>
         <w:ind w:left="720" w:hanging="360"/>
       </w:pPr>
       <w:r>
         <w:rPr>
           <w:rtl w:val="0"/>
         </w:rPr>
-        <w:t xml:space="preserve">Es muy sencillo de aprender.</w:t>
+        <w:t xml:space="preserve">Menú de navegación.</w:t>
       </w:r>
     </w:p>
     <w:p>
@@ -3624,14 +3081,14 @@
           <w:ilvl w:val="0"/>
           <w:numId w:val="2"/>
         </w:numPr>
-        <w:spacing w:after="0" w:afterAutospacing="0" w:before="0" w:beforeAutospacing="0" w:lineRule="auto"/>
+        <w:spacing w:line="480" w:lineRule="auto"/>
         <w:ind w:left="720" w:hanging="360"/>
       </w:pPr>
       <w:r>
         <w:rPr>
           <w:rtl w:val="0"/>
         </w:rPr>
-        <w:t xml:space="preserve">Funciona con HTML, CSS y JavaScript.</w:t>
+        <w:t xml:space="preserve">Tarjetas interactivas.</w:t>
       </w:r>
     </w:p>
     <w:p>
@@ -3640,14 +3097,14 @@
           <w:ilvl w:val="0"/>
           <w:numId w:val="2"/>
         </w:numPr>
-        <w:spacing w:after="0" w:afterAutospacing="0" w:before="0" w:beforeAutospacing="0" w:lineRule="auto"/>
+        <w:spacing w:line="480" w:lineRule="auto"/>
         <w:ind w:left="720" w:hanging="360"/>
       </w:pPr>
       <w:r>
         <w:rPr>
           <w:rtl w:val="0"/>
         </w:rPr>
-        <w:t xml:space="preserve">Tiene componentes listos (menús, tarjetas, botones, carruseles, etc.).</w:t>
+        <w:t xml:space="preserve">Carrusel de imágenes.</w:t>
       </w:r>
     </w:p>
     <w:p>
@@ -3656,112 +3113,381 @@
           <w:ilvl w:val="0"/>
           <w:numId w:val="2"/>
         </w:numPr>
-        <w:spacing w:after="240" w:before="0" w:beforeAutospacing="0" w:lineRule="auto"/>
+        <w:spacing w:line="480" w:lineRule="auto"/>
         <w:ind w:left="720" w:hanging="360"/>
       </w:pPr>
       <w:r>
         <w:rPr>
           <w:rtl w:val="0"/>
         </w:rPr>
-        <w:t xml:space="preserve">Es perfecto para una página informativa.</w:t>
-      </w:r>
-    </w:p>
-    <w:p>
-      <w:pPr>
-        <w:spacing w:after="240" w:before="240" w:lineRule="auto"/>
-        <w:rPr/>
-      </w:pPr>
-      <w:r>
-        <w:rPr>
-          <w:rtl w:val="0"/>
-        </w:rPr>
-        <w:t xml:space="preserve">Por ejemplo, podrían hacer:</w:t>
+        <w:t xml:space="preserve">Secciones organizadas.</w:t>
       </w:r>
     </w:p>
     <w:p>
       <w:pPr>
         <w:numPr>
           <w:ilvl w:val="0"/>
-          <w:numId w:val="5"/>
+          <w:numId w:val="2"/>
         </w:numPr>
-        <w:spacing w:after="0" w:afterAutospacing="0" w:before="240" w:lineRule="auto"/>
+        <w:spacing w:line="480" w:lineRule="auto"/>
         <w:ind w:left="720" w:hanging="360"/>
       </w:pPr>
       <w:r>
         <w:rPr>
           <w:rtl w:val="0"/>
         </w:rPr>
-        <w:t xml:space="preserve">Un menú de navegación.</w:t>
+        <w:t xml:space="preserve">Diseño responsive.</w:t>
       </w:r>
     </w:p>
     <w:p>
       <w:pPr>
         <w:numPr>
           <w:ilvl w:val="0"/>
-          <w:numId w:val="5"/>
+          <w:numId w:val="2"/>
         </w:numPr>
-        <w:spacing w:after="0" w:afterAutospacing="0" w:before="0" w:beforeAutospacing="0" w:lineRule="auto"/>
+        <w:spacing w:line="480" w:lineRule="auto"/>
         <w:ind w:left="720" w:hanging="360"/>
       </w:pPr>
       <w:r>
         <w:rPr>
           <w:rtl w:val="0"/>
         </w:rPr>
-        <w:t xml:space="preserve">Tarjetas para cada anime.</w:t>
+        <w:t xml:space="preserve">Efectos visuales.</w:t>
       </w:r>
     </w:p>
     <w:p>
       <w:pPr>
         <w:numPr>
           <w:ilvl w:val="0"/>
-          <w:numId w:val="5"/>
+          <w:numId w:val="2"/>
         </w:numPr>
-        <w:spacing w:after="0" w:afterAutospacing="0" w:before="0" w:beforeAutospacing="0" w:lineRule="auto"/>
+        <w:spacing w:line="480" w:lineRule="auto"/>
         <w:ind w:left="720" w:hanging="360"/>
       </w:pPr>
       <w:r>
         <w:rPr>
           <w:rtl w:val="0"/>
         </w:rPr>
-        <w:t xml:space="preserve">Tarjetas para personajes.</w:t>
-      </w:r>
-    </w:p>
-    <w:p>
-      <w:pPr>
-        <w:numPr>
-          <w:ilvl w:val="0"/>
-          <w:numId w:val="5"/>
-        </w:numPr>
-        <w:spacing w:after="0" w:afterAutospacing="0" w:before="0" w:beforeAutospacing="0" w:lineRule="auto"/>
-        <w:ind w:left="720" w:hanging="360"/>
-      </w:pPr>
-      <w:r>
-        <w:rPr>
-          <w:rtl w:val="0"/>
-        </w:rPr>
-        <w:t xml:space="preserve">Un carrusel con animes recomendados.</w:t>
-      </w:r>
-    </w:p>
-    <w:p>
-      <w:pPr>
-        <w:numPr>
-          <w:ilvl w:val="0"/>
-          <w:numId w:val="5"/>
-        </w:numPr>
-        <w:spacing w:after="240" w:before="0" w:beforeAutospacing="0" w:lineRule="auto"/>
-        <w:ind w:left="720" w:hanging="360"/>
-      </w:pPr>
-      <w:r>
-        <w:rPr>
-          <w:rtl w:val="0"/>
-        </w:rPr>
-        <w:t xml:space="preserve">Una sección de noticias.</w:t>
-      </w:r>
-    </w:p>
-    <w:p>
-      <w:pPr>
+        <w:t xml:space="preserve">Contenido dinámico.</w:t>
+      </w:r>
+    </w:p>
+    <w:p>
+      <w:pPr>
+        <w:pStyle w:val="Heading1"/>
+        <w:keepNext w:val="0"/>
+        <w:keepLines w:val="0"/>
+        <w:spacing w:after="80" w:line="480" w:lineRule="auto"/>
         <w:rPr/>
       </w:pPr>
+      <w:bookmarkStart w:colFirst="0" w:colLast="0" w:name="_xh6b6okjz7my" w:id="23"/>
+      <w:bookmarkEnd w:id="23"/>
+      <w:r>
+        <w:rPr>
+          <w:rtl w:val="0"/>
+        </w:rPr>
+        <w:t xml:space="preserve">Referencias </w:t>
+      </w:r>
+    </w:p>
+    <w:p>
+      <w:pPr>
+        <w:spacing w:after="240" w:before="240" w:line="480" w:lineRule="auto"/>
+        <w:rPr>
+          <w:rFonts w:ascii="Times New Roman" w:cs="Times New Roman" w:eastAsia="Times New Roman" w:hAnsi="Times New Roman"/>
+          <w:color w:val="1155cc"/>
+          <w:sz w:val="24"/>
+          <w:szCs w:val="24"/>
+          <w:u w:val="single"/>
+        </w:rPr>
+      </w:pPr>
+      <w:r>
+        <w:rPr>
+          <w:rFonts w:ascii="Times New Roman" w:cs="Times New Roman" w:eastAsia="Times New Roman" w:hAnsi="Times New Roman"/>
+          <w:sz w:val="24"/>
+          <w:szCs w:val="24"/>
+          <w:rtl w:val="0"/>
+        </w:rPr>
+        <w:t xml:space="preserve">PHP Group. (2025). </w:t>
+      </w:r>
+      <w:r>
+        <w:rPr>
+          <w:rFonts w:ascii="Times New Roman" w:cs="Times New Roman" w:eastAsia="Times New Roman" w:hAnsi="Times New Roman"/>
+          <w:i w:val="1"/>
+          <w:iCs w:val="1"/>
+          <w:sz w:val="24"/>
+          <w:szCs w:val="24"/>
+          <w:rtl w:val="0"/>
+        </w:rPr>
+        <w:t xml:space="preserve">PHP Documentation</w:t>
+      </w:r>
+      <w:r>
+        <w:rPr>
+          <w:rFonts w:ascii="Times New Roman" w:cs="Times New Roman" w:eastAsia="Times New Roman" w:hAnsi="Times New Roman"/>
+          <w:sz w:val="24"/>
+          <w:szCs w:val="24"/>
+          <w:rtl w:val="0"/>
+        </w:rPr>
+        <w:t xml:space="preserve">.</w:t>
+      </w:r>
+      <w:hyperlink r:id="rId6">
+        <w:r>
+          <w:rPr>
+            <w:rFonts w:ascii="Times New Roman" w:cs="Times New Roman" w:eastAsia="Times New Roman" w:hAnsi="Times New Roman"/>
+            <w:color w:val="1155cc"/>
+            <w:sz w:val="24"/>
+            <w:szCs w:val="24"/>
+            <w:u w:val="single"/>
+            <w:rtl w:val="0"/>
+          </w:rPr>
+          <w:t xml:space="preserve"> https://www.php.net</w:t>
+        </w:r>
+      </w:hyperlink>
+      <w:r>
+        <w:rPr>
+          <w:rtl w:val="0"/>
+        </w:rPr>
+      </w:r>
+    </w:p>
+    <w:p>
+      <w:pPr>
+        <w:spacing w:after="240" w:before="240" w:line="480" w:lineRule="auto"/>
+        <w:rPr>
+          <w:rFonts w:ascii="Times New Roman" w:cs="Times New Roman" w:eastAsia="Times New Roman" w:hAnsi="Times New Roman"/>
+          <w:color w:val="1155cc"/>
+          <w:sz w:val="24"/>
+          <w:szCs w:val="24"/>
+          <w:u w:val="single"/>
+        </w:rPr>
+      </w:pPr>
+      <w:r>
+        <w:rPr>
+          <w:rFonts w:ascii="Times New Roman" w:cs="Times New Roman" w:eastAsia="Times New Roman" w:hAnsi="Times New Roman"/>
+          <w:sz w:val="24"/>
+          <w:szCs w:val="24"/>
+          <w:rtl w:val="0"/>
+        </w:rPr>
+        <w:t xml:space="preserve">Bootstrap Team. (2025). </w:t>
+      </w:r>
+      <w:r>
+        <w:rPr>
+          <w:rFonts w:ascii="Times New Roman" w:cs="Times New Roman" w:eastAsia="Times New Roman" w:hAnsi="Times New Roman"/>
+          <w:i w:val="1"/>
+          <w:iCs w:val="1"/>
+          <w:sz w:val="24"/>
+          <w:szCs w:val="24"/>
+          <w:rtl w:val="0"/>
+        </w:rPr>
+        <w:t xml:space="preserve">Bootstrap Documentation</w:t>
+      </w:r>
+      <w:r>
+        <w:rPr>
+          <w:rFonts w:ascii="Times New Roman" w:cs="Times New Roman" w:eastAsia="Times New Roman" w:hAnsi="Times New Roman"/>
+          <w:sz w:val="24"/>
+          <w:szCs w:val="24"/>
+          <w:rtl w:val="0"/>
+        </w:rPr>
+        <w:t xml:space="preserve">.</w:t>
+      </w:r>
+      <w:hyperlink r:id="rId7">
+        <w:r>
+          <w:rPr>
+            <w:rFonts w:ascii="Times New Roman" w:cs="Times New Roman" w:eastAsia="Times New Roman" w:hAnsi="Times New Roman"/>
+            <w:color w:val="1155cc"/>
+            <w:sz w:val="24"/>
+            <w:szCs w:val="24"/>
+            <w:u w:val="single"/>
+            <w:rtl w:val="0"/>
+          </w:rPr>
+          <w:t xml:space="preserve"> https://getbootstrap.com</w:t>
+        </w:r>
+      </w:hyperlink>
+      <w:r>
+        <w:rPr>
+          <w:rtl w:val="0"/>
+        </w:rPr>
+      </w:r>
+    </w:p>
+    <w:p>
+      <w:pPr>
+        <w:spacing w:after="240" w:before="240" w:line="480" w:lineRule="auto"/>
+        <w:rPr>
+          <w:rFonts w:ascii="Times New Roman" w:cs="Times New Roman" w:eastAsia="Times New Roman" w:hAnsi="Times New Roman"/>
+          <w:color w:val="1155cc"/>
+          <w:sz w:val="24"/>
+          <w:szCs w:val="24"/>
+          <w:u w:val="single"/>
+        </w:rPr>
+      </w:pPr>
+      <w:r>
+        <w:rPr>
+          <w:rFonts w:ascii="Times New Roman" w:cs="Times New Roman" w:eastAsia="Times New Roman" w:hAnsi="Times New Roman"/>
+          <w:sz w:val="24"/>
+          <w:szCs w:val="24"/>
+          <w:rtl w:val="0"/>
+        </w:rPr>
+        <w:t xml:space="preserve">GitHub. (2025). </w:t>
+      </w:r>
+      <w:r>
+        <w:rPr>
+          <w:rFonts w:ascii="Times New Roman" w:cs="Times New Roman" w:eastAsia="Times New Roman" w:hAnsi="Times New Roman"/>
+          <w:i w:val="1"/>
+          <w:iCs w:val="1"/>
+          <w:sz w:val="24"/>
+          <w:szCs w:val="24"/>
+          <w:rtl w:val="0"/>
+        </w:rPr>
+        <w:t xml:space="preserve">GitHub Docs</w:t>
+      </w:r>
+      <w:r>
+        <w:rPr>
+          <w:rFonts w:ascii="Times New Roman" w:cs="Times New Roman" w:eastAsia="Times New Roman" w:hAnsi="Times New Roman"/>
+          <w:sz w:val="24"/>
+          <w:szCs w:val="24"/>
+          <w:rtl w:val="0"/>
+        </w:rPr>
+        <w:t xml:space="preserve">.</w:t>
+      </w:r>
+      <w:hyperlink r:id="rId8">
+        <w:r>
+          <w:rPr>
+            <w:rFonts w:ascii="Times New Roman" w:cs="Times New Roman" w:eastAsia="Times New Roman" w:hAnsi="Times New Roman"/>
+            <w:color w:val="1155cc"/>
+            <w:sz w:val="24"/>
+            <w:szCs w:val="24"/>
+            <w:u w:val="single"/>
+            <w:rtl w:val="0"/>
+          </w:rPr>
+          <w:t xml:space="preserve"> https://docs.github.com</w:t>
+        </w:r>
+      </w:hyperlink>
+      <w:r>
+        <w:rPr>
+          <w:rtl w:val="0"/>
+        </w:rPr>
+      </w:r>
+    </w:p>
+    <w:p>
+      <w:pPr>
+        <w:pStyle w:val="Heading1"/>
+        <w:keepNext w:val="0"/>
+        <w:keepLines w:val="0"/>
+        <w:spacing w:after="80" w:line="480" w:lineRule="auto"/>
+        <w:rPr/>
+      </w:pPr>
+      <w:bookmarkStart w:colFirst="0" w:colLast="0" w:name="_541usnlsfhfv" w:id="24"/>
+      <w:bookmarkEnd w:id="24"/>
+      <w:r>
+        <w:rPr>
+          <w:rtl w:val="0"/>
+        </w:rPr>
+      </w:r>
+    </w:p>
+    <w:p>
+      <w:pPr>
+        <w:pStyle w:val="Heading1"/>
+        <w:keepNext w:val="0"/>
+        <w:keepLines w:val="0"/>
+        <w:spacing w:after="80" w:line="480" w:lineRule="auto"/>
+        <w:rPr/>
+      </w:pPr>
+      <w:bookmarkStart w:colFirst="0" w:colLast="0" w:name="_8h9udn8qyc3n" w:id="25"/>
+      <w:bookmarkEnd w:id="25"/>
+      <w:r>
+        <w:rPr>
+          <w:rtl w:val="0"/>
+        </w:rPr>
+        <w:t xml:space="preserve">Conclusiones</w:t>
+      </w:r>
+    </w:p>
+    <w:p>
+      <w:pPr>
+        <w:spacing w:line="480" w:lineRule="auto"/>
+        <w:rPr/>
+      </w:pPr>
+      <w:r>
+        <w:rPr>
+          <w:rtl w:val="0"/>
+        </w:rPr>
+        <w:t xml:space="preserve">Gracias a este proyecto aprendimos sobre tecnologías modernas de desarrollo web, el funcionamiento de los frameworks y la importancia de organizar correctamente un proyecto.</w:t>
+      </w:r>
+    </w:p>
+    <w:p>
+      <w:pPr>
+        <w:spacing w:line="480" w:lineRule="auto"/>
+        <w:rPr/>
+      </w:pPr>
+      <w:r>
+        <w:rPr>
+          <w:rtl w:val="0"/>
+        </w:rPr>
+        <w:t xml:space="preserve">También comprendimos la diferencia entre frontend y backend, además de aprender a utilizar herramientas como Bootstrap, Git y GitHub para crear aplicaciones web modernas y organizadas.</w:t>
+      </w:r>
+    </w:p>
+    <w:p>
+      <w:pPr>
+        <w:spacing w:line="480" w:lineRule="auto"/>
+        <w:rPr>
+          <w:rFonts w:ascii="Times New Roman" w:cs="Times New Roman" w:eastAsia="Times New Roman" w:hAnsi="Times New Roman"/>
+          <w:sz w:val="48"/>
+          <w:szCs w:val="48"/>
+        </w:rPr>
+      </w:pPr>
+      <w:r>
+        <w:rPr>
+          <w:rtl w:val="0"/>
+        </w:rPr>
+      </w:r>
+    </w:p>
+    <w:p>
+      <w:pPr>
+        <w:spacing w:line="480" w:lineRule="auto"/>
+        <w:ind w:left="90" w:firstLine="0"/>
+        <w:jc w:val="center"/>
+        <w:rPr>
+          <w:rFonts w:ascii="Times New Roman" w:cs="Times New Roman" w:eastAsia="Times New Roman" w:hAnsi="Times New Roman"/>
+          <w:b w:val="1"/>
+          <w:bCs w:val="1"/>
+          <w:sz w:val="24"/>
+          <w:szCs w:val="24"/>
+        </w:rPr>
+      </w:pPr>
+      <w:r>
+        <w:rPr>
+          <w:rtl w:val="0"/>
+        </w:rPr>
+      </w:r>
+    </w:p>
+    <w:p>
+      <w:pPr>
+        <w:spacing w:line="480" w:lineRule="auto"/>
+        <w:ind w:left="90" w:firstLine="0"/>
+        <w:jc w:val="center"/>
+        <w:rPr>
+          <w:rFonts w:ascii="Times New Roman" w:cs="Times New Roman" w:eastAsia="Times New Roman" w:hAnsi="Times New Roman"/>
+          <w:b w:val="1"/>
+          <w:bCs w:val="1"/>
+          <w:sz w:val="24"/>
+          <w:szCs w:val="24"/>
+        </w:rPr>
+      </w:pPr>
+      <w:r>
+        <w:rPr>
+          <w:rtl w:val="0"/>
+        </w:rPr>
+      </w:r>
+    </w:p>
+    <w:p>
+      <w:pPr>
+        <w:spacing w:line="240" w:lineRule="auto"/>
+        <w:ind w:left="90" w:firstLine="0"/>
+        <w:jc w:val="center"/>
+        <w:rPr>
+          <w:rFonts w:ascii="Times New Roman" w:cs="Times New Roman" w:eastAsia="Times New Roman" w:hAnsi="Times New Roman"/>
+          <w:b w:val="1"/>
+          <w:bCs w:val="1"/>
+          <w:sz w:val="24"/>
+          <w:szCs w:val="24"/>
+        </w:rPr>
+      </w:pPr>
       <w:r>
         <w:rPr>
           <w:rtl w:val="0"/>
@@ -3769,13 +3495,77 @@
       </w:r>
     </w:p>
     <w:sectPr>
+      <w:headerReference r:id="rId9" w:type="default"/>
+      <w:headerReference r:id="rId10" w:type="even"/>
+      <w:footerReference r:id="rId11" w:type="even"/>
       <w:type w:val="nextPage"/>
       <w:pgSz w:h="16834" w:w="11909" w:orient="portrait"/>
-      <w:pgMar w:bottom="1440.0000000000002" w:top="1440.0000000000002" w:left="1440.0000000000002" w:right="1440.0000000000002" w:header="720" w:footer="720"/>
+      <w:pgMar w:bottom="1440.0000000000002" w:top="1440.0000000000002" w:left="1440.0000000000002" w:right="1440.0000000000002" w:header="1133.8582677165355" w:footer="1133.8582677165355"/>
       <w:pgNumType w:start="1"/>
     </w:sectPr>
   </w:body>
 </w:document>
+</file>
+
+<file path=word/footer1.xml><?xml version="1.0" encoding="utf-8"?>
+<w:ftr xmlns:mc="http://schemas.openxmlformats.org/markup-compatibility/2006" xmlns:o="urn:schemas-microsoft-com:office:office" xmlns:r="http://schemas.openxmlformats.org/officeDocument/2006/relationships" xmlns:m="http://schemas.openxmlformats.org/officeDocument/2006/math" xmlns:v="urn:schemas-microsoft-com:vml" xmlns:wp="http://schemas.openxmlformats.org/drawingml/2006/wordprocessingDrawing" xmlns:w10="urn:schemas-microsoft-com:office:word" xmlns:w="http://schemas.openxmlformats.org/wordprocessingml/2006/main" xmlns:wne="http://schemas.microsoft.com/office/word/2006/wordml" xmlns:sl="http://schemas.openxmlformats.org/schemaLibrary/2006/main" xmlns:a="http://schemas.openxmlformats.org/drawingml/2006/main" xmlns:pic="http://schemas.openxmlformats.org/drawingml/2006/picture" xmlns:c="http://schemas.openxmlformats.org/drawingml/2006/chart" xmlns:lc="http://schemas.openxmlformats.org/drawingml/2006/lockedCanvas" xmlns:dgm="http://schemas.openxmlformats.org/drawingml/2006/diagram" xmlns:wps="http://schemas.microsoft.com/office/word/2010/wordprocessingShape" xmlns:wpg="http://schemas.microsoft.com/office/word/2010/wordprocessingGroup" xmlns:w14="http://schemas.microsoft.com/office/word/2010/wordml" xmlns:w15="http://schemas.microsoft.com/office/word/2012/wordml" xmlns:w16="http://schemas.microsoft.com/office/word/2018/wordml" xmlns:w16cex="http://schemas.microsoft.com/office/word/2018/wordml/cex" xmlns:w16cid="http://schemas.microsoft.com/office/word/2016/wordml/cid" xmlns="http://schemas.microsoft.com/office/tasks/2019/documenttasks" xmlns:cr="http://schemas.microsoft.com/office/comments/2020/reactions">
+  <w:p>
+    <w:pPr>
+      <w:rPr/>
+    </w:pPr>
+    <w:r>
+      <w:rPr>
+        <w:rtl w:val="0"/>
+      </w:rPr>
+    </w:r>
+  </w:p>
+</w:ftr>
+</file>
+
+<file path=word/header1.xml><?xml version="1.0" encoding="utf-8"?>
+<w:hdr xmlns:mc="http://schemas.openxmlformats.org/markup-compatibility/2006" xmlns:o="urn:schemas-microsoft-com:office:office" xmlns:r="http://schemas.openxmlformats.org/officeDocument/2006/relationships" xmlns:m="http://schemas.openxmlformats.org/officeDocument/2006/math" xmlns:v="urn:schemas-microsoft-com:vml" xmlns:wp="http://schemas.openxmlformats.org/drawingml/2006/wordprocessingDrawing" xmlns:w10="urn:schemas-microsoft-com:office:word" xmlns:w="http://schemas.openxmlformats.org/wordprocessingml/2006/main" xmlns:wne="http://schemas.microsoft.com/office/word/2006/wordml" xmlns:sl="http://schemas.openxmlformats.org/schemaLibrary/2006/main" xmlns:a="http://schemas.openxmlformats.org/drawingml/2006/main" xmlns:pic="http://schemas.openxmlformats.org/drawingml/2006/picture" xmlns:c="http://schemas.openxmlformats.org/drawingml/2006/chart" xmlns:lc="http://schemas.openxmlformats.org/drawingml/2006/lockedCanvas" xmlns:dgm="http://schemas.openxmlformats.org/drawingml/2006/diagram" xmlns:wps="http://schemas.microsoft.com/office/word/2010/wordprocessingShape" xmlns:wpg="http://schemas.microsoft.com/office/word/2010/wordprocessingGroup" xmlns:w14="http://schemas.microsoft.com/office/word/2010/wordml" xmlns:w15="http://schemas.microsoft.com/office/word/2012/wordml" xmlns:w16="http://schemas.microsoft.com/office/word/2018/wordml" xmlns:w16cex="http://schemas.microsoft.com/office/word/2018/wordml/cex" xmlns:w16cid="http://schemas.microsoft.com/office/word/2016/wordml/cid" xmlns="http://schemas.microsoft.com/office/tasks/2019/documenttasks" xmlns:cr="http://schemas.microsoft.com/office/comments/2020/reactions">
+  <w:p>
+    <w:pPr>
+      <w:jc w:val="right"/>
+      <w:rPr/>
+    </w:pPr>
+    <w:r>
+      <w:rPr/>
+      <w:fldChar w:fldCharType="begin"/>
+      <w:instrText xml:space="preserve">PAGE</w:instrText>
+      <w:fldChar w:fldCharType="separate"/>
+      <w:fldChar w:fldCharType="end"/>
+    </w:r>
+    <w:r>
+      <w:rPr>
+        <w:rtl w:val="0"/>
+      </w:rPr>
+    </w:r>
+  </w:p>
+</w:hdr>
+</file>
+
+<file path=word/header2.xml><?xml version="1.0" encoding="utf-8"?>
+<w:hdr xmlns:mc="http://schemas.openxmlformats.org/markup-compatibility/2006" xmlns:o="urn:schemas-microsoft-com:office:office" xmlns:r="http://schemas.openxmlformats.org/officeDocument/2006/relationships" xmlns:m="http://schemas.openxmlformats.org/officeDocument/2006/math" xmlns:v="urn:schemas-microsoft-com:vml" xmlns:wp="http://schemas.openxmlformats.org/drawingml/2006/wordprocessingDrawing" xmlns:w10="urn:schemas-microsoft-com:office:word" xmlns:w="http://schemas.openxmlformats.org/wordprocessingml/2006/main" xmlns:wne="http://schemas.microsoft.com/office/word/2006/wordml" xmlns:sl="http://schemas.openxmlformats.org/schemaLibrary/2006/main" xmlns:a="http://schemas.openxmlformats.org/drawingml/2006/main" xmlns:pic="http://schemas.openxmlformats.org/drawingml/2006/picture" xmlns:c="http://schemas.openxmlformats.org/drawingml/2006/chart" xmlns:lc="http://schemas.openxmlformats.org/drawingml/2006/lockedCanvas" xmlns:dgm="http://schemas.openxmlformats.org/drawingml/2006/diagram" xmlns:wps="http://schemas.microsoft.com/office/word/2010/wordprocessingShape" xmlns:wpg="http://schemas.microsoft.com/office/word/2010/wordprocessingGroup" xmlns:w14="http://schemas.microsoft.com/office/word/2010/wordml" xmlns:w15="http://schemas.microsoft.com/office/word/2012/wordml" xmlns:w16="http://schemas.microsoft.com/office/word/2018/wordml" xmlns:w16cex="http://schemas.microsoft.com/office/word/2018/wordml/cex" xmlns:w16cid="http://schemas.microsoft.com/office/word/2016/wordml/cid" xmlns="http://schemas.microsoft.com/office/tasks/2019/documenttasks" xmlns:cr="http://schemas.microsoft.com/office/comments/2020/reactions">
+  <w:p>
+    <w:pPr>
+      <w:jc w:val="right"/>
+      <w:rPr/>
+    </w:pPr>
+    <w:r>
+      <w:rPr/>
+      <w:fldChar w:fldCharType="begin"/>
+      <w:instrText xml:space="preserve">PAGE</w:instrText>
+      <w:fldChar w:fldCharType="separate"/>
+      <w:fldChar w:fldCharType="end"/>
+    </w:r>
+    <w:r>
+      <w:rPr>
+        <w:rtl w:val="0"/>
+      </w:rPr>
+    </w:r>
+  </w:p>
+</w:hdr>
 </file>
 
 <file path=word/numbering.xml><?xml version="1.0" encoding="utf-8"?>
@@ -4001,226 +3791,6 @@
     </w:lvl>
   </w:abstractNum>
   <w:abstractNum w:abstractNumId="3">
-    <w:lvl w:ilvl="0">
-      <w:start w:val="1"/>
-      <w:numFmt w:val="bullet"/>
-      <w:lvlText w:val="●"/>
-      <w:lvlJc w:val="left"/>
-      <w:pPr>
-        <w:ind w:left="720" w:hanging="360"/>
-      </w:pPr>
-      <w:rPr>
-        <w:u w:val="none"/>
-      </w:rPr>
-    </w:lvl>
-    <w:lvl w:ilvl="1">
-      <w:start w:val="1"/>
-      <w:numFmt w:val="bullet"/>
-      <w:lvlText w:val="○"/>
-      <w:lvlJc w:val="left"/>
-      <w:pPr>
-        <w:ind w:left="1440" w:hanging="360"/>
-      </w:pPr>
-      <w:rPr>
-        <w:u w:val="none"/>
-      </w:rPr>
-    </w:lvl>
-    <w:lvl w:ilvl="2">
-      <w:start w:val="1"/>
-      <w:numFmt w:val="bullet"/>
-      <w:lvlText w:val="■"/>
-      <w:lvlJc w:val="left"/>
-      <w:pPr>
-        <w:ind w:left="2160" w:hanging="360"/>
-      </w:pPr>
-      <w:rPr>
-        <w:u w:val="none"/>
-      </w:rPr>
-    </w:lvl>
-    <w:lvl w:ilvl="3">
-      <w:start w:val="1"/>
-      <w:numFmt w:val="bullet"/>
-      <w:lvlText w:val="●"/>
-      <w:lvlJc w:val="left"/>
-      <w:pPr>
-        <w:ind w:left="2880" w:hanging="360"/>
-      </w:pPr>
-      <w:rPr>
-        <w:u w:val="none"/>
-      </w:rPr>
-    </w:lvl>
-    <w:lvl w:ilvl="4">
-      <w:start w:val="1"/>
-      <w:numFmt w:val="bullet"/>
-      <w:lvlText w:val="○"/>
-      <w:lvlJc w:val="left"/>
-      <w:pPr>
-        <w:ind w:left="3600" w:hanging="360"/>
-      </w:pPr>
-      <w:rPr>
-        <w:u w:val="none"/>
-      </w:rPr>
-    </w:lvl>
-    <w:lvl w:ilvl="5">
-      <w:start w:val="1"/>
-      <w:numFmt w:val="bullet"/>
-      <w:lvlText w:val="■"/>
-      <w:lvlJc w:val="left"/>
-      <w:pPr>
-        <w:ind w:left="4320" w:hanging="360"/>
-      </w:pPr>
-      <w:rPr>
-        <w:u w:val="none"/>
-      </w:rPr>
-    </w:lvl>
-    <w:lvl w:ilvl="6">
-      <w:start w:val="1"/>
-      <w:numFmt w:val="bullet"/>
-      <w:lvlText w:val="●"/>
-      <w:lvlJc w:val="left"/>
-      <w:pPr>
-        <w:ind w:left="5040" w:hanging="360"/>
-      </w:pPr>
-      <w:rPr>
-        <w:u w:val="none"/>
-      </w:rPr>
-    </w:lvl>
-    <w:lvl w:ilvl="7">
-      <w:start w:val="1"/>
-      <w:numFmt w:val="bullet"/>
-      <w:lvlText w:val="○"/>
-      <w:lvlJc w:val="left"/>
-      <w:pPr>
-        <w:ind w:left="5760" w:hanging="360"/>
-      </w:pPr>
-      <w:rPr>
-        <w:u w:val="none"/>
-      </w:rPr>
-    </w:lvl>
-    <w:lvl w:ilvl="8">
-      <w:start w:val="1"/>
-      <w:numFmt w:val="bullet"/>
-      <w:lvlText w:val="■"/>
-      <w:lvlJc w:val="left"/>
-      <w:pPr>
-        <w:ind w:left="6480" w:hanging="360"/>
-      </w:pPr>
-      <w:rPr>
-        <w:u w:val="none"/>
-      </w:rPr>
-    </w:lvl>
-  </w:abstractNum>
-  <w:abstractNum w:abstractNumId="4">
-    <w:lvl w:ilvl="0">
-      <w:start w:val="1"/>
-      <w:numFmt w:val="bullet"/>
-      <w:lvlText w:val="●"/>
-      <w:lvlJc w:val="left"/>
-      <w:pPr>
-        <w:ind w:left="720" w:hanging="360"/>
-      </w:pPr>
-      <w:rPr>
-        <w:u w:val="none"/>
-      </w:rPr>
-    </w:lvl>
-    <w:lvl w:ilvl="1">
-      <w:start w:val="1"/>
-      <w:numFmt w:val="bullet"/>
-      <w:lvlText w:val="○"/>
-      <w:lvlJc w:val="left"/>
-      <w:pPr>
-        <w:ind w:left="1440" w:hanging="360"/>
-      </w:pPr>
-      <w:rPr>
-        <w:u w:val="none"/>
-      </w:rPr>
-    </w:lvl>
-    <w:lvl w:ilvl="2">
-      <w:start w:val="1"/>
-      <w:numFmt w:val="bullet"/>
-      <w:lvlText w:val="■"/>
-      <w:lvlJc w:val="left"/>
-      <w:pPr>
-        <w:ind w:left="2160" w:hanging="360"/>
-      </w:pPr>
-      <w:rPr>
-        <w:u w:val="none"/>
-      </w:rPr>
-    </w:lvl>
-    <w:lvl w:ilvl="3">
-      <w:start w:val="1"/>
-      <w:numFmt w:val="bullet"/>
-      <w:lvlText w:val="●"/>
-      <w:lvlJc w:val="left"/>
-      <w:pPr>
-        <w:ind w:left="2880" w:hanging="360"/>
-      </w:pPr>
-      <w:rPr>
-        <w:u w:val="none"/>
-      </w:rPr>
-    </w:lvl>
-    <w:lvl w:ilvl="4">
-      <w:start w:val="1"/>
-      <w:numFmt w:val="bullet"/>
-      <w:lvlText w:val="○"/>
-      <w:lvlJc w:val="left"/>
-      <w:pPr>
-        <w:ind w:left="3600" w:hanging="360"/>
-      </w:pPr>
-      <w:rPr>
-        <w:u w:val="none"/>
-      </w:rPr>
-    </w:lvl>
-    <w:lvl w:ilvl="5">
-      <w:start w:val="1"/>
-      <w:numFmt w:val="bullet"/>
-      <w:lvlText w:val="■"/>
-      <w:lvlJc w:val="left"/>
-      <w:pPr>
-        <w:ind w:left="4320" w:hanging="360"/>
-      </w:pPr>
-      <w:rPr>
-        <w:u w:val="none"/>
-      </w:rPr>
-    </w:lvl>
-    <w:lvl w:ilvl="6">
-      <w:start w:val="1"/>
-      <w:numFmt w:val="bullet"/>
-      <w:lvlText w:val="●"/>
-      <w:lvlJc w:val="left"/>
-      <w:pPr>
-        <w:ind w:left="5040" w:hanging="360"/>
-      </w:pPr>
-      <w:rPr>
-        <w:u w:val="none"/>
-      </w:rPr>
-    </w:lvl>
-    <w:lvl w:ilvl="7">
-      <w:start w:val="1"/>
-      <w:numFmt w:val="bullet"/>
-      <w:lvlText w:val="○"/>
-      <w:lvlJc w:val="left"/>
-      <w:pPr>
-        <w:ind w:left="5760" w:hanging="360"/>
-      </w:pPr>
-      <w:rPr>
-        <w:u w:val="none"/>
-      </w:rPr>
-    </w:lvl>
-    <w:lvl w:ilvl="8">
-      <w:start w:val="1"/>
-      <w:numFmt w:val="bullet"/>
-      <w:lvlText w:val="■"/>
-      <w:lvlJc w:val="left"/>
-      <w:pPr>
-        <w:ind w:left="6480" w:hanging="360"/>
-      </w:pPr>
-      <w:rPr>
-        <w:u w:val="none"/>
-      </w:rPr>
-    </w:lvl>
-  </w:abstractNum>
-  <w:abstractNum w:abstractNumId="5">
     <w:lvl w:ilvl="0">
       <w:start w:val="1"/>
       <w:numFmt w:val="bullet"/>
@@ -4338,12 +3908,6 @@
   </w:num>
   <w:num w:numId="3">
     <w:abstractNumId w:val="3"/>
-  </w:num>
-  <w:num w:numId="4">
-    <w:abstractNumId w:val="4"/>
-  </w:num>
-  <w:num w:numId="5">
-    <w:abstractNumId w:val="5"/>
   </w:num>
 </w:numbering>
 </file>

</xml_diff>